<commit_message>
Implement WAL + queues
</commit_message>
<xml_diff>
--- a/BubbleFish - Planning/2026.03.25 - BubbleFish - Idea-Seed.docx
+++ b/BubbleFish - Planning/2026.03.25 - BubbleFish - Idea-Seed.docx
@@ -4,6 +4,9 @@
   <w:body>
     <w:p>
       <w:r>
+        <w:br/>
+      </w:r>
+      <w:r>
         <w:t xml:space="preserve">Shawn: </w:t>
       </w:r>
       <w:r>
@@ -21,15 +24,7 @@
     </w:p>
     <w:p>
       <w:r>
-        <w:t xml:space="preserve">When you need to connect multiple </w:t>
-      </w:r>
-      <w:proofErr w:type="gramStart"/>
-      <w:r>
-        <w:t>applications—</w:t>
-      </w:r>
-      <w:proofErr w:type="gramEnd"/>
-      <w:r>
-        <w:t>especially those using different protocols, languages, or connection instructions—to a single hub, developers typically use one of a few specific architectural patterns.</w:t>
+        <w:t>When you need to connect multiple applications—especially those using different protocols, languages, or connection instructions—to a single hub, developers typically use one of a few specific architectural patterns.</w:t>
       </w:r>
     </w:p>
     <w:p>
@@ -64,40 +59,15 @@
           <w:numId w:val="1"/>
         </w:numPr>
       </w:pPr>
-      <w:proofErr w:type="spellStart"/>
-      <w:r>
-        <w:rPr>
-          <w:b/>
-          <w:bCs/>
-        </w:rPr>
-        <w:t>Moleculer</w:t>
-      </w:r>
-      <w:proofErr w:type="spellEnd"/>
-      <w:r>
-        <w:rPr>
-          <w:b/>
-          <w:bCs/>
-        </w:rPr>
-        <w:t>:</w:t>
-      </w:r>
-      <w:r>
-        <w:t xml:space="preserve"> This is a fast, modern microservices framework for Node.js. It acts as a central nervous system. The magic of </w:t>
-      </w:r>
-      <w:proofErr w:type="spellStart"/>
-      <w:r>
-        <w:t>Moleculer</w:t>
-      </w:r>
-      <w:proofErr w:type="spellEnd"/>
-      <w:r>
-        <w:t xml:space="preserve"> is its "Transporters." You can have one application connecting via TCP, another via Redis, and another via MQTT, and </w:t>
-      </w:r>
-      <w:proofErr w:type="spellStart"/>
-      <w:r>
-        <w:t>Moleculer</w:t>
-      </w:r>
-      <w:proofErr w:type="spellEnd"/>
-      <w:r>
-        <w:t xml:space="preserve"> routes all their messages together seamlessly as if they were in the same application.</w:t>
+      <w:r>
+        <w:rPr>
+          <w:b/>
+          <w:bCs/>
+        </w:rPr>
+        <w:t>Moleculer:</w:t>
+      </w:r>
+      <w:r>
+        <w:t xml:space="preserve"> This is a fast, modern microservices framework for Node.js. It acts as a central nervous system. The magic of Moleculer is its "Transporters." You can have one application connecting via TCP, another via Redis, and another via MQTT, and Moleculer routes all their messages together seamlessly as if they were in the same application.</w:t>
       </w:r>
     </w:p>
     <w:p>
@@ -177,15 +147,7 @@
         </w:numPr>
       </w:pPr>
       <w:r>
-        <w:t xml:space="preserve">It comes with hundreds of pre-built "nodes" that know how to connect to different databases, APIs, hardware devices, and protocols (like </w:t>
-      </w:r>
-      <w:proofErr w:type="spellStart"/>
-      <w:r>
-        <w:t>WebSockets</w:t>
-      </w:r>
-      <w:proofErr w:type="spellEnd"/>
-      <w:r>
-        <w:t>, HTTP, TCP, Bluetooth).</w:t>
+        <w:t>It comes with hundreds of pre-built "nodes" that know how to connect to different databases, APIs, hardware devices, and protocols (like WebSockets, HTTP, TCP, Bluetooth).</w:t>
       </w:r>
     </w:p>
     <w:p>
@@ -196,6 +158,7 @@
         </w:numPr>
       </w:pPr>
       <w:r>
+        <w:lastRenderedPageBreak/>
         <w:t>You simply drag and drop these connection nodes into a workspace and wire them to a single central processing node.</w:t>
       </w:r>
     </w:p>
@@ -211,7 +174,6 @@
           <w:b/>
           <w:bCs/>
         </w:rPr>
-        <w:lastRenderedPageBreak/>
         <w:t>3. Message Brokers (The industry standard)</w:t>
       </w:r>
     </w:p>
@@ -263,15 +225,7 @@
         <w:t>Apache Kafka:</w:t>
       </w:r>
       <w:r>
-        <w:t xml:space="preserve"> </w:t>
-      </w:r>
-      <w:proofErr w:type="gramStart"/>
-      <w:r>
-        <w:t>Similar to</w:t>
-      </w:r>
-      <w:proofErr w:type="gramEnd"/>
-      <w:r>
-        <w:t xml:space="preserve"> RabbitMQ but built for massive, high-speed data streaming. It acts as a central log where all your different apps write data, and your main application reads from it.</w:t>
+        <w:t xml:space="preserve"> Similar to RabbitMQ but built for massive, high-speed data streaming. It acts as a central log where all your different apps write data, and your main application reads from it.</w:t>
       </w:r>
     </w:p>
     <w:p>
@@ -291,31 +245,7 @@
     </w:p>
     <w:p>
       <w:r>
-        <w:t xml:space="preserve">If the applications are </w:t>
-      </w:r>
-      <w:proofErr w:type="gramStart"/>
-      <w:r>
-        <w:t>connecting</w:t>
-      </w:r>
-      <w:proofErr w:type="gramEnd"/>
-      <w:r>
-        <w:t xml:space="preserve"> over the internet (via HTTP/REST, </w:t>
-      </w:r>
-      <w:proofErr w:type="spellStart"/>
-      <w:r>
-        <w:t>WebSockets</w:t>
-      </w:r>
-      <w:proofErr w:type="spellEnd"/>
-      <w:r>
-        <w:t xml:space="preserve">, or </w:t>
-      </w:r>
-      <w:proofErr w:type="spellStart"/>
-      <w:r>
-        <w:t>GraphQL</w:t>
-      </w:r>
-      <w:proofErr w:type="spellEnd"/>
-      <w:r>
-        <w:t xml:space="preserve">), you would use an </w:t>
+        <w:t xml:space="preserve">If the applications are connecting over the internet (via HTTP/REST, WebSockets, or GraphQL), you would use an </w:t>
       </w:r>
       <w:r>
         <w:rPr>
@@ -329,10 +259,11 @@
       </w:r>
     </w:p>
     <w:p>
-      <w:hyperlink r:id="rId5" w:tgtFrame="_blank" w:history="1">
+      <w:hyperlink r:id="rId7" w:tgtFrame="_blank" w:history="1">
         <w:r>
           <w:rPr>
             <w:rStyle w:val="Hyperlink"/>
+            <w:noProof/>
           </w:rPr>
           <w:drawing>
             <wp:inline distT="0" distB="0" distL="0" distR="0" wp14:anchorId="78EE1CBD" wp14:editId="757E9518">
@@ -352,7 +283,7 @@
                       </pic:cNvPicPr>
                     </pic:nvPicPr>
                     <pic:blipFill>
-                      <a:blip r:embed="rId6" cstate="print">
+                      <a:blip r:embed="rId8" cstate="print">
                         <a:extLst>
                           <a:ext uri="{28A0092B-C50C-407E-A947-70E740481C1C}">
                             <a14:useLocalDpi xmlns:a14="http://schemas.microsoft.com/office/drawing/2010/main" val="0"/>
@@ -404,7 +335,6 @@
         </w:numPr>
       </w:pPr>
       <w:r>
-        <w:lastRenderedPageBreak/>
         <w:t xml:space="preserve">Tools like </w:t>
       </w:r>
       <w:r>
@@ -417,7 +347,6 @@
       <w:r>
         <w:t xml:space="preserve">, </w:t>
       </w:r>
-      <w:proofErr w:type="spellStart"/>
       <w:r>
         <w:rPr>
           <w:b/>
@@ -425,7 +354,6 @@
         </w:rPr>
         <w:t>KrakenD</w:t>
       </w:r>
-      <w:proofErr w:type="spellEnd"/>
       <w:r>
         <w:t xml:space="preserve">, or even a custom </w:t>
       </w:r>
@@ -454,7 +382,7 @@
     <w:p>
       <w:r>
         <w:pict w14:anchorId="61D18228">
-          <v:rect id="_x0000_i1037" style="width:0;height:1.5pt" o:hralign="center" o:hrstd="t" o:hrnoshade="t" o:hr="t" fillcolor="gray" stroked="f"/>
+          <v:rect id="_x0000_i1025" style="width:0;height:1.5pt" o:hralign="center" o:hrstd="t" o:hrnoshade="t" o:hr="t" fillcolor="gray" stroked="f"/>
         </w:pict>
       </w:r>
     </w:p>
@@ -471,7 +399,6 @@
       <w:r>
         <w:t xml:space="preserve">If you want to write code to handle this inside a Node.js environment, </w:t>
       </w:r>
-      <w:proofErr w:type="spellStart"/>
       <w:r>
         <w:rPr>
           <w:b/>
@@ -479,7 +406,6 @@
         </w:rPr>
         <w:t>Moleculer</w:t>
       </w:r>
-      <w:proofErr w:type="spellEnd"/>
       <w:r>
         <w:t xml:space="preserve"> is your best bet. If you want a visual drag-and-drop tool, look at </w:t>
       </w:r>
@@ -515,39 +441,11 @@
         <w:t xml:space="preserve">Shawn: </w:t>
       </w:r>
       <w:r>
-        <w:t xml:space="preserve">Consider the build we did yesterday connecting Claude to Open brain with 1 server, then Perplexity Comet to Open Brain with a second server. What if we created something called multinode.js that was able to connect both Claude and Perplexity Comet to </w:t>
-      </w:r>
-      <w:proofErr w:type="spellStart"/>
-      <w:r>
-        <w:t>OpenBrain</w:t>
-      </w:r>
-      <w:proofErr w:type="spellEnd"/>
-      <w:r>
-        <w:t xml:space="preserve"> at the same time and </w:t>
-      </w:r>
-      <w:proofErr w:type="gramStart"/>
-      <w:r>
-        <w:t>seamless</w:t>
-      </w:r>
-      <w:proofErr w:type="gramEnd"/>
-      <w:r>
-        <w:t xml:space="preserve"> handle data from </w:t>
-      </w:r>
-      <w:proofErr w:type="gramStart"/>
-      <w:r>
-        <w:t>both of them</w:t>
-      </w:r>
-      <w:proofErr w:type="gramEnd"/>
-      <w:r>
-        <w:t xml:space="preserve"> at the same time to retrieve or input data into </w:t>
-      </w:r>
-      <w:proofErr w:type="spellStart"/>
-      <w:r>
-        <w:t>Supabase</w:t>
-      </w:r>
-      <w:proofErr w:type="spellEnd"/>
-      <w:r>
-        <w:t>?</w:t>
+        <w:t xml:space="preserve">Consider the build we did yesterday connecting Claude to Open brain with 1 server, </w:t>
+      </w:r>
+      <w:r>
+        <w:lastRenderedPageBreak/>
+        <w:t>then Perplexity Comet to Open Brain with a second server. What if we created something called multinode.js that was able to connect both Claude and Perplexity Comet to OpenBrain at the same time and seamless handle data from both of them at the same time to retrieve or input data into Supabase?</w:t>
       </w:r>
       <w:r>
         <w:br/>
@@ -596,23 +494,7 @@
     </w:p>
     <w:p>
       <w:r>
-        <w:t xml:space="preserve">Right now, you have a 1:1 relationship: Claude talks to Server A which talks to </w:t>
-      </w:r>
-      <w:proofErr w:type="spellStart"/>
-      <w:r>
-        <w:t>Supabase</w:t>
-      </w:r>
-      <w:proofErr w:type="spellEnd"/>
-      <w:r>
-        <w:t xml:space="preserve">, and Perplexity Comet talks to Server B which talks to </w:t>
-      </w:r>
-      <w:proofErr w:type="spellStart"/>
-      <w:r>
-        <w:t>Supabase</w:t>
-      </w:r>
-      <w:proofErr w:type="spellEnd"/>
-      <w:r>
-        <w:t>.</w:t>
+        <w:t>Right now, you have a 1:1 relationship: Claude talks to Server A which talks to Supabase, and Perplexity Comet talks to Server B which talks to Supabase.</w:t>
       </w:r>
     </w:p>
     <w:p>
@@ -621,10 +503,11 @@
       </w:r>
     </w:p>
     <w:p>
-      <w:hyperlink r:id="rId7" w:tgtFrame="_blank" w:history="1">
+      <w:hyperlink r:id="rId9" w:tgtFrame="_blank" w:history="1">
         <w:r>
           <w:rPr>
             <w:rStyle w:val="Hyperlink"/>
+            <w:noProof/>
           </w:rPr>
           <w:drawing>
             <wp:inline distT="0" distB="0" distL="0" distR="0" wp14:anchorId="31C7182D" wp14:editId="2051A8BC">
@@ -644,7 +527,7 @@
                       </pic:cNvPicPr>
                     </pic:nvPicPr>
                     <pic:blipFill>
-                      <a:blip r:embed="rId6" cstate="print">
+                      <a:blip r:embed="rId8" cstate="print">
                         <a:extLst>
                           <a:ext uri="{28A0092B-C50C-407E-A947-70E740481C1C}">
                             <a14:useLocalDpi xmlns:a14="http://schemas.microsoft.com/office/drawing/2010/main" val="0"/>
@@ -685,6 +568,7 @@
     </w:p>
     <w:p>
       <w:r>
+        <w:lastRenderedPageBreak/>
         <w:t>Shutterstock</w:t>
       </w:r>
     </w:p>
@@ -715,21 +599,8 @@
         </w:numPr>
       </w:pPr>
       <w:r>
-        <w:t>POST /</w:t>
-      </w:r>
-      <w:proofErr w:type="spellStart"/>
-      <w:r>
-        <w:t>api</w:t>
-      </w:r>
-      <w:proofErr w:type="spellEnd"/>
-      <w:r>
-        <w:t>/inbound/</w:t>
-      </w:r>
-      <w:proofErr w:type="spellStart"/>
-      <w:r>
-        <w:t>claude</w:t>
-      </w:r>
-      <w:proofErr w:type="spellEnd"/>
+        <w:t>POST /api/inbound/claude</w:t>
+      </w:r>
     </w:p>
     <w:p>
       <w:pPr>
@@ -739,15 +610,7 @@
         </w:numPr>
       </w:pPr>
       <w:r>
-        <w:t>POST /</w:t>
-      </w:r>
-      <w:proofErr w:type="spellStart"/>
-      <w:r>
-        <w:t>api</w:t>
-      </w:r>
-      <w:proofErr w:type="spellEnd"/>
-      <w:r>
-        <w:t>/inbound/perplexity</w:t>
+        <w:t>POST /api/inbound/perplexity</w:t>
       </w:r>
     </w:p>
     <w:p>
@@ -777,88 +640,21 @@
         </w:numPr>
       </w:pPr>
       <w:r>
-        <w:lastRenderedPageBreak/>
-        <w:t xml:space="preserve">It takes Claude's output and Perplexity's output and maps them both to a single, standardized JSON object (e.g., </w:t>
-      </w:r>
-      <w:proofErr w:type="gramStart"/>
-      <w:r>
-        <w:t>{ source</w:t>
-      </w:r>
-      <w:proofErr w:type="gramEnd"/>
-      <w:r>
-        <w:t xml:space="preserve">, intent, payload, </w:t>
-      </w:r>
-      <w:proofErr w:type="gramStart"/>
-      <w:r>
-        <w:t>timestamp }</w:t>
-      </w:r>
-      <w:proofErr w:type="gramEnd"/>
-      <w:r>
-        <w:t>).</w:t>
-      </w:r>
-    </w:p>
-    <w:p>
-      <w:r>
-        <w:rPr>
-          <w:b/>
-          <w:bCs/>
-        </w:rPr>
-        <w:t xml:space="preserve">3. Centralized </w:t>
-      </w:r>
-      <w:proofErr w:type="spellStart"/>
-      <w:r>
-        <w:rPr>
-          <w:b/>
-          <w:bCs/>
-        </w:rPr>
-        <w:t>Supabase</w:t>
-      </w:r>
-      <w:proofErr w:type="spellEnd"/>
-      <w:r>
-        <w:rPr>
-          <w:b/>
-          <w:bCs/>
-        </w:rPr>
-        <w:t xml:space="preserve"> Connection (The Memory)</w:t>
-      </w:r>
-    </w:p>
-    <w:p>
-      <w:r>
-        <w:t xml:space="preserve">Instead of two servers managing their own database connection pools, multinode.js initializes the </w:t>
-      </w:r>
-      <w:proofErr w:type="spellStart"/>
-      <w:r>
-        <w:t>Supabase</w:t>
-      </w:r>
-      <w:proofErr w:type="spellEnd"/>
-      <w:r>
-        <w:t xml:space="preserve"> client exactly once. Both the Claude route and the Perplexity route use the exact same internal functions (like </w:t>
-      </w:r>
-      <w:proofErr w:type="spellStart"/>
-      <w:proofErr w:type="gramStart"/>
-      <w:r>
-        <w:t>queryOpenBrain</w:t>
-      </w:r>
-      <w:proofErr w:type="spellEnd"/>
-      <w:r>
-        <w:t>(</w:t>
-      </w:r>
-      <w:proofErr w:type="gramEnd"/>
-      <w:r>
-        <w:t xml:space="preserve">) or </w:t>
-      </w:r>
-      <w:proofErr w:type="spellStart"/>
-      <w:proofErr w:type="gramStart"/>
-      <w:r>
-        <w:t>writeToOpenBrain</w:t>
-      </w:r>
-      <w:proofErr w:type="spellEnd"/>
-      <w:r>
-        <w:t>(</w:t>
-      </w:r>
-      <w:proofErr w:type="gramEnd"/>
-      <w:r>
-        <w:t>)). This prevents database locking issues and makes your code incredibly clean.</w:t>
+        <w:t>It takes Claude's output and Perplexity's output and maps them both to a single, standardized JSON object (e.g., { source, intent, payload, timestamp }).</w:t>
+      </w:r>
+    </w:p>
+    <w:p>
+      <w:r>
+        <w:rPr>
+          <w:b/>
+          <w:bCs/>
+        </w:rPr>
+        <w:t>3. Centralized Supabase Connection (The Memory)</w:t>
+      </w:r>
+    </w:p>
+    <w:p>
+      <w:r>
+        <w:t>Instead of two servers managing their own database connection pools, multinode.js initializes the Supabase client exactly once. Both the Claude route and the Perplexity route use the exact same internal functions (like queryOpenBrain() or writeToOpenBrain()). This prevents database locking issues and makes your code incredibly clean.</w:t>
       </w:r>
     </w:p>
     <w:p>
@@ -878,15 +674,7 @@
     </w:p>
     <w:p>
       <w:r>
-        <w:t xml:space="preserve">You mentioned wanting to handle data from </w:t>
-      </w:r>
-      <w:proofErr w:type="gramStart"/>
-      <w:r>
-        <w:t>both of them</w:t>
-      </w:r>
-      <w:proofErr w:type="gramEnd"/>
-      <w:r>
-        <w:t xml:space="preserve"> </w:t>
+        <w:t xml:space="preserve">You mentioned wanting to handle data from both of them </w:t>
       </w:r>
       <w:r>
         <w:rPr>
@@ -911,15 +699,7 @@
     </w:p>
     <w:p>
       <w:r>
-        <w:t xml:space="preserve">If Claude sends a massive chunk of data to analyze, and multinode.js asks </w:t>
-      </w:r>
-      <w:proofErr w:type="spellStart"/>
-      <w:r>
-        <w:t>Supabase</w:t>
-      </w:r>
-      <w:proofErr w:type="spellEnd"/>
-      <w:r>
-        <w:t xml:space="preserve"> to store it, Node </w:t>
+        <w:t xml:space="preserve">If Claude sends a massive chunk of data to analyze, and multinode.js asks Supabase to store it, Node </w:t>
       </w:r>
       <w:r>
         <w:rPr>
@@ -929,31 +709,7 @@
         <w:t>does not wait</w:t>
       </w:r>
       <w:r>
-        <w:t xml:space="preserve"> for </w:t>
-      </w:r>
-      <w:proofErr w:type="spellStart"/>
-      <w:r>
-        <w:t>Supabase</w:t>
-      </w:r>
-      <w:proofErr w:type="spellEnd"/>
-      <w:r>
-        <w:t xml:space="preserve"> to finish saving before moving on. It pauses that specific task, keeps the server completely open, and can immediately accept an incoming query from Perplexity Comet in the very next millisecond. Once </w:t>
-      </w:r>
-      <w:proofErr w:type="spellStart"/>
-      <w:r>
-        <w:t>Supabase</w:t>
-      </w:r>
-      <w:proofErr w:type="spellEnd"/>
-      <w:r>
-        <w:t xml:space="preserve"> finishes saving Claude's data, Node picks that task back up and sends Claude a </w:t>
-      </w:r>
-      <w:proofErr w:type="gramStart"/>
-      <w:r>
-        <w:t>success</w:t>
-      </w:r>
-      <w:proofErr w:type="gramEnd"/>
-      <w:r>
-        <w:t xml:space="preserve"> response.</w:t>
+        <w:t xml:space="preserve"> for Supabase to finish saving before moving on. It pauses that specific task, keeps the server completely open, and can immediately accept an incoming query from Perplexity Comet in the very next millisecond. Once Supabase finishes saving Claude's data, Node picks that task back up and sends Claude a success response.</w:t>
       </w:r>
     </w:p>
     <w:p>
@@ -973,15 +729,7 @@
     </w:p>
     <w:p>
       <w:r>
-        <w:t xml:space="preserve">If you built this, your multinode.js file would structurally </w:t>
-      </w:r>
-      <w:proofErr w:type="gramStart"/>
-      <w:r>
-        <w:t>look something</w:t>
-      </w:r>
-      <w:proofErr w:type="gramEnd"/>
-      <w:r>
-        <w:t xml:space="preserve"> like this:</w:t>
+        <w:t>If you built this, your multinode.js file would structurally look something like this:</w:t>
       </w:r>
     </w:p>
     <w:p>
@@ -996,18 +744,11 @@
           <w:b/>
           <w:bCs/>
         </w:rPr>
+        <w:lastRenderedPageBreak/>
         <w:t>Initialize</w:t>
       </w:r>
       <w:r>
-        <w:t xml:space="preserve"> the </w:t>
-      </w:r>
-      <w:proofErr w:type="spellStart"/>
-      <w:r>
-        <w:t>Supabase</w:t>
-      </w:r>
-      <w:proofErr w:type="spellEnd"/>
-      <w:r>
-        <w:t xml:space="preserve"> client.</w:t>
+        <w:t xml:space="preserve"> the Supabase client.</w:t>
       </w:r>
     </w:p>
     <w:p>
@@ -1043,15 +784,7 @@
         <w:t>Route A:</w:t>
       </w:r>
       <w:r>
-        <w:t xml:space="preserve"> Logic specifically for Claude's webhooks/API calls -&gt; Normalizes data -&gt; Calls </w:t>
-      </w:r>
-      <w:proofErr w:type="spellStart"/>
-      <w:r>
-        <w:t>Supabase</w:t>
-      </w:r>
-      <w:proofErr w:type="spellEnd"/>
-      <w:r>
-        <w:t>.</w:t>
+        <w:t xml:space="preserve"> Logic specifically for Claude's webhooks/API calls -&gt; Normalizes data -&gt; Calls Supabase.</w:t>
       </w:r>
     </w:p>
     <w:p>
@@ -1069,15 +802,7 @@
         <w:t>Route B:</w:t>
       </w:r>
       <w:r>
-        <w:t xml:space="preserve"> Logic specifically for Perplexity's API calls -&gt; Normalizes data -&gt; Calls </w:t>
-      </w:r>
-      <w:proofErr w:type="spellStart"/>
-      <w:r>
-        <w:t>Supabase</w:t>
-      </w:r>
-      <w:proofErr w:type="spellEnd"/>
-      <w:r>
-        <w:t>.</w:t>
+        <w:t xml:space="preserve"> Logic specifically for Perplexity's API calls -&gt; Normalizes data -&gt; Calls Supabase.</w:t>
       </w:r>
     </w:p>
     <w:p>
@@ -1095,62 +820,21 @@
         <w:t>Listen</w:t>
       </w:r>
       <w:r>
-        <w:t xml:space="preserve"> </w:t>
-      </w:r>
-      <w:proofErr w:type="gramStart"/>
-      <w:r>
-        <w:t>on</w:t>
-      </w:r>
-      <w:proofErr w:type="gramEnd"/>
-      <w:r>
-        <w:t xml:space="preserve"> a single port (e.g., 3000).</w:t>
-      </w:r>
-    </w:p>
-    <w:p>
-      <w:r>
-        <w:t xml:space="preserve">This makes your system infinitely scalable. If you decide to add local models via Ollama or </w:t>
-      </w:r>
-      <w:proofErr w:type="spellStart"/>
-      <w:r>
-        <w:t>OpenClaw</w:t>
-      </w:r>
-      <w:proofErr w:type="spellEnd"/>
-      <w:r>
-        <w:t xml:space="preserve"> down the road, you don't need a third server; you just add a POST /</w:t>
-      </w:r>
-      <w:proofErr w:type="spellStart"/>
-      <w:r>
-        <w:t>api</w:t>
-      </w:r>
-      <w:proofErr w:type="spellEnd"/>
-      <w:r>
-        <w:t>/inbound/local-</w:t>
-      </w:r>
-      <w:proofErr w:type="spellStart"/>
-      <w:r>
-        <w:t>llm</w:t>
-      </w:r>
-      <w:proofErr w:type="spellEnd"/>
-      <w:r>
-        <w:t xml:space="preserve"> route to multinode.js.</w:t>
-      </w:r>
-    </w:p>
-    <w:p>
-      <w:r>
-        <w:t xml:space="preserve">Would you like me to draft the Express.js boilerplate for multinode.js so we can see what the code for those unified </w:t>
-      </w:r>
-      <w:proofErr w:type="spellStart"/>
-      <w:r>
-        <w:t>Supabase</w:t>
-      </w:r>
-      <w:proofErr w:type="spellEnd"/>
-      <w:r>
-        <w:t xml:space="preserve"> routes looks like?</w:t>
-      </w:r>
-    </w:p>
-    <w:p>
-      <w:r>
-        <w:lastRenderedPageBreak/>
+        <w:t xml:space="preserve"> on a single port (e.g., 3000).</w:t>
+      </w:r>
+    </w:p>
+    <w:p>
+      <w:r>
+        <w:t>This makes your system infinitely scalable. If you decide to add local models via Ollama or OpenClaw down the road, you don't need a third server; you just add a POST /api/inbound/local-llm route to multinode.js.</w:t>
+      </w:r>
+    </w:p>
+    <w:p>
+      <w:r>
+        <w:t>Would you like me to draft the Express.js boilerplate for multinode.js so we can see what the code for those unified Supabase routes looks like?</w:t>
+      </w:r>
+    </w:p>
+    <w:p>
+      <w:r>
         <w:t xml:space="preserve">Shawn: </w:t>
       </w:r>
       <w:r>
@@ -1175,15 +859,7 @@
     </w:p>
     <w:p>
       <w:r>
-        <w:t xml:space="preserve">Here is the breakdown of the landscape, the value of </w:t>
-      </w:r>
-      <w:proofErr w:type="gramStart"/>
-      <w:r>
-        <w:t>open-sourcing</w:t>
-      </w:r>
-      <w:proofErr w:type="gramEnd"/>
-      <w:r>
-        <w:t xml:space="preserve"> it, and exactly how we can engineer it to be a standout repository.</w:t>
+        <w:t>Here is the breakdown of the landscape, the value of open-sourcing it, and exactly how we can engineer it to be a standout repository.</w:t>
       </w:r>
     </w:p>
     <w:p>
@@ -1238,21 +914,12 @@
           <w:numId w:val="8"/>
         </w:numPr>
       </w:pPr>
-      <w:proofErr w:type="spellStart"/>
-      <w:r>
-        <w:rPr>
-          <w:b/>
-          <w:bCs/>
-        </w:rPr>
-        <w:t>LiteLLM</w:t>
-      </w:r>
-      <w:proofErr w:type="spellEnd"/>
-      <w:r>
-        <w:rPr>
-          <w:b/>
-          <w:bCs/>
-        </w:rPr>
-        <w:t>:</w:t>
+      <w:r>
+        <w:rPr>
+          <w:b/>
+          <w:bCs/>
+        </w:rPr>
+        <w:t>LiteLLM:</w:t>
       </w:r>
       <w:r>
         <w:t xml:space="preserve"> An open-source tool that translates APIs from over 100 different LLMs into the standard OpenAI format. However, it is primarily built in Python.</w:t>
@@ -1270,34 +937,10 @@
           <w:b/>
           <w:bCs/>
         </w:rPr>
-        <w:t xml:space="preserve">Portkey / </w:t>
-      </w:r>
-      <w:proofErr w:type="spellStart"/>
-      <w:r>
-        <w:rPr>
-          <w:b/>
-          <w:bCs/>
-        </w:rPr>
-        <w:t>LangChain</w:t>
-      </w:r>
-      <w:proofErr w:type="spellEnd"/>
-      <w:r>
-        <w:rPr>
-          <w:b/>
-          <w:bCs/>
-        </w:rPr>
-        <w:t>:</w:t>
-      </w:r>
-      <w:r>
-        <w:t xml:space="preserve"> These are heavier frameworks that handle routing, </w:t>
-      </w:r>
-      <w:proofErr w:type="gramStart"/>
-      <w:r>
-        <w:t>caching</w:t>
-      </w:r>
-      <w:proofErr w:type="gramEnd"/>
-      <w:r>
-        <w:t>, and guardrails for multiple models.</w:t>
+        <w:t>Portkey / LangChain:</w:t>
+      </w:r>
+      <w:r>
+        <w:t xml:space="preserve"> These are heavier frameworks that handle routing, caching, and guardrails for multiple models.</w:t>
       </w:r>
     </w:p>
     <w:p>
@@ -1324,18 +967,11 @@
           <w:b/>
           <w:bCs/>
         </w:rPr>
+        <w:lastRenderedPageBreak/>
         <w:t>The Gap in the Market:</w:t>
       </w:r>
       <w:r>
-        <w:t xml:space="preserve"> Many of the existing tools are heavily focused on Python, or they are massive, bloated enterprise platforms. A clean, lightweight, purpose-built Node.js orchestration layer—specifically designed to ingest data from multiple AI agents and push it to a unified database like </w:t>
-      </w:r>
-      <w:proofErr w:type="spellStart"/>
-      <w:r>
-        <w:t>Supabase</w:t>
-      </w:r>
-      <w:proofErr w:type="spellEnd"/>
-      <w:r>
-        <w:t xml:space="preserve"> (your "Open Brain")—has a distinct and highly practical niche.</w:t>
+        <w:t xml:space="preserve"> Many of the existing tools are heavily focused on Python, or they are massive, bloated enterprise platforms. A clean, lightweight, purpose-built Node.js orchestration layer—specifically designed to ingest data from multiple AI agents and push it to a unified database like Supabase (your "Open Brain")—has a distinct and highly practical niche.</w:t>
       </w:r>
     </w:p>
     <w:p>
@@ -1380,30 +1016,21 @@
     </w:p>
     <w:p>
       <w:r>
-        <w:t xml:space="preserve">Releasing this on GitHub is a phenomenal portfolio piece. If you are discussing enterprise AI adoption with teams or interviewing for roles focused on managing AI outcomes, being able to point to a functioning, scalable architectural layer that solves the "fragmented AI" problem speaks volumes. It demonstrates a deep, practical understanding of how Generative AI </w:t>
-      </w:r>
-      <w:proofErr w:type="gramStart"/>
-      <w:r>
-        <w:t>actually integrates</w:t>
-      </w:r>
-      <w:proofErr w:type="gramEnd"/>
-      <w:r>
-        <w:t xml:space="preserve"> into modern business systems, moving beyond just simple prompt engineering.</w:t>
-      </w:r>
-    </w:p>
-    <w:p>
-      <w:pPr>
-        <w:rPr>
-          <w:b/>
-          <w:bCs/>
-        </w:rPr>
-      </w:pPr>
-      <w:r>
-        <w:rPr>
-          <w:b/>
-          <w:bCs/>
-        </w:rPr>
-        <w:lastRenderedPageBreak/>
+        <w:t>Releasing this on GitHub is a phenomenal portfolio piece. If you are discussing enterprise AI adoption with teams or interviewing for roles focused on managing AI outcomes, being able to point to a functioning, scalable architectural layer that solves the "fragmented AI" problem speaks volumes. It demonstrates a deep, practical understanding of how Generative AI actually integrates into modern business systems, moving beyond just simple prompt engineering.</w:t>
+      </w:r>
+    </w:p>
+    <w:p>
+      <w:pPr>
+        <w:rPr>
+          <w:b/>
+          <w:bCs/>
+        </w:rPr>
+      </w:pPr>
+      <w:r>
+        <w:rPr>
+          <w:b/>
+          <w:bCs/>
+        </w:rPr>
         <w:t>3. How could we improve on this?</w:t>
       </w:r>
     </w:p>
@@ -1427,23 +1054,7 @@
         <w:t>The Local-to-Cloud Bridge:</w:t>
       </w:r>
       <w:r>
-        <w:t xml:space="preserve"> Right now, you are using cloud models (Claude, Perplexity). You could build a specific POST /</w:t>
-      </w:r>
-      <w:proofErr w:type="spellStart"/>
-      <w:r>
-        <w:t>api</w:t>
-      </w:r>
-      <w:proofErr w:type="spellEnd"/>
-      <w:r>
-        <w:t xml:space="preserve">/inbound/local route. If you have a local AI development environment running via WSL2 on a Windows 11 machine—using tools like Ollama or </w:t>
-      </w:r>
-      <w:proofErr w:type="spellStart"/>
-      <w:r>
-        <w:t>OpenClaw</w:t>
-      </w:r>
-      <w:proofErr w:type="spellEnd"/>
-      <w:r>
-        <w:t>—you can pipe those local models directly into the exact same Open Brain database. This allows developers to test their logic for free locally before spending money on API calls to Anthropic.</w:t>
+        <w:t xml:space="preserve"> Right now, you are using cloud models (Claude, Perplexity). You could build a specific POST /api/inbound/local route. If you have a local AI development environment running via WSL2 on a Windows 11 machine—using tools like Ollama or OpenClaw—you can pipe those local models directly into the exact same Open Brain database. This allows developers to test their logic for free locally before spending money on API calls to Anthropic.</w:t>
       </w:r>
     </w:p>
     <w:p>
@@ -1461,15 +1072,7 @@
         <w:t>Agentic Handoffs (Chaining):</w:t>
       </w:r>
       <w:r>
-        <w:t xml:space="preserve"> Instead of just acting as a passive funnel to </w:t>
-      </w:r>
-      <w:proofErr w:type="spellStart"/>
-      <w:r>
-        <w:t>Supabase</w:t>
-      </w:r>
-      <w:proofErr w:type="spellEnd"/>
-      <w:r>
-        <w:t xml:space="preserve">, multinode.js can become an active workflow manager. For example: Perplexity Comet fetches live web research and sends it to the router. The router automatically takes that raw data, forwards it to Claude for synthesis and formatting, and </w:t>
+        <w:t xml:space="preserve"> Instead of just acting as a passive funnel to Supabase, multinode.js can become an active workflow manager. For example: Perplexity Comet fetches live web research and sends it to the router. The router automatically takes that raw data, forwards it to Claude for synthesis and formatting, and </w:t>
       </w:r>
       <w:r>
         <w:rPr>
@@ -1479,15 +1082,7 @@
         <w:t>then</w:t>
       </w:r>
       <w:r>
-        <w:t xml:space="preserve"> writes the final, polished output to </w:t>
-      </w:r>
-      <w:proofErr w:type="spellStart"/>
-      <w:r>
-        <w:t>Supabase</w:t>
-      </w:r>
-      <w:proofErr w:type="spellEnd"/>
-      <w:r>
-        <w:t>.</w:t>
+        <w:t xml:space="preserve"> writes the final, polished output to Supabase.</w:t>
       </w:r>
     </w:p>
     <w:p>
@@ -1505,15 +1100,7 @@
         <w:t>Edge Hardware Endpoints:</w:t>
       </w:r>
       <w:r>
-        <w:t xml:space="preserve"> You could design ultra-lightweight ingestion routes meant specifically for portable developer hardware (like an M5Stack </w:t>
-      </w:r>
-      <w:proofErr w:type="spellStart"/>
-      <w:r>
-        <w:t>Cardputer</w:t>
-      </w:r>
-      <w:proofErr w:type="spellEnd"/>
-      <w:r>
-        <w:t>) or ethical hacking tools. This would allow a user to fire off quick, formatted data points into the Open Brain from remote, low-power devices.</w:t>
+        <w:t xml:space="preserve"> You could design ultra-lightweight ingestion routes meant specifically for portable developer hardware (like an M5Stack Cardputer) or ethical hacking tools. This would allow a user to fire off quick, formatted data points into the Open Brain from remote, low-power devices.</w:t>
       </w:r>
     </w:p>
     <w:p>
@@ -1528,18 +1115,11 @@
           <w:b/>
           <w:bCs/>
         </w:rPr>
+        <w:lastRenderedPageBreak/>
         <w:t>Standardized JSON Schemas (The Universal Translator):</w:t>
       </w:r>
       <w:r>
-        <w:t xml:space="preserve"> The biggest headache in multi-LLM routing is data formatting. You can improve this project by enforcing strict TypeScript interfaces or Zod validation schemas. Whether the data comes from Claude or Perplexity, multinode.js forcefully strips it down and repackages it into one perfect, predictable JSON object before </w:t>
-      </w:r>
-      <w:proofErr w:type="spellStart"/>
-      <w:r>
-        <w:t>Supabase</w:t>
-      </w:r>
-      <w:proofErr w:type="spellEnd"/>
-      <w:r>
-        <w:t xml:space="preserve"> ever sees it.</w:t>
+        <w:t xml:space="preserve"> The biggest headache in multi-LLM routing is data formatting. You can improve this project by enforcing strict TypeScript interfaces or Zod validation schemas. Whether the data comes from Claude or Perplexity, multinode.js forcefully strips it down and repackages it into one perfect, predictable JSON object before Supabase ever sees it.</w:t>
       </w:r>
     </w:p>
     <w:p>
@@ -1571,75 +1151,7 @@
         <w:t xml:space="preserve">Shawn: </w:t>
       </w:r>
       <w:r>
-        <w:t xml:space="preserve">How do we make it super easy with a wizard for someone to set up a) the single point it connects to (Open brain, but let's make it agnostic) b) the multiple solutions that will connect to it? We want to make sure it accepts 0Auth, API Key, None, </w:t>
-      </w:r>
-      <w:proofErr w:type="gramStart"/>
-      <w:r>
-        <w:t>Etc.</w:t>
-      </w:r>
-      <w:proofErr w:type="gramEnd"/>
-      <w:r>
-        <w:t xml:space="preserve"> </w:t>
-      </w:r>
-      <w:proofErr w:type="gramStart"/>
-      <w:r>
-        <w:t>we</w:t>
-      </w:r>
-      <w:proofErr w:type="gramEnd"/>
-      <w:r>
-        <w:t xml:space="preserve"> want it to be super simple to set up or update without </w:t>
-      </w:r>
-      <w:proofErr w:type="gramStart"/>
-      <w:r>
-        <w:t>have to</w:t>
-      </w:r>
-      <w:proofErr w:type="gramEnd"/>
-      <w:r>
-        <w:t xml:space="preserve"> open notepad. We want to be able to customize what it "talks to". It will </w:t>
-      </w:r>
-      <w:proofErr w:type="gramStart"/>
-      <w:r>
-        <w:t>features</w:t>
-      </w:r>
-      <w:proofErr w:type="gramEnd"/>
-      <w:r>
-        <w:t xml:space="preserve"> a </w:t>
-      </w:r>
-      <w:proofErr w:type="gramStart"/>
-      <w:r>
-        <w:t>really cool</w:t>
-      </w:r>
-      <w:proofErr w:type="gramEnd"/>
-      <w:r>
-        <w:t xml:space="preserve"> terminal view that will use different </w:t>
-      </w:r>
-      <w:r>
-        <w:lastRenderedPageBreak/>
-        <w:t xml:space="preserve">colors to show the different things connecting to it with colors for successful and failed communications. It will </w:t>
-      </w:r>
-      <w:proofErr w:type="gramStart"/>
-      <w:r>
-        <w:t>auto queue</w:t>
-      </w:r>
-      <w:proofErr w:type="gramEnd"/>
-      <w:r>
-        <w:t xml:space="preserve"> </w:t>
-      </w:r>
-      <w:proofErr w:type="gramStart"/>
-      <w:r>
-        <w:t>requests</w:t>
-      </w:r>
-      <w:proofErr w:type="gramEnd"/>
-      <w:r>
-        <w:t xml:space="preserve"> so they wait in line until another request is completed. It will create different log files for each thing trying to connect to make troubleshooting errors </w:t>
-      </w:r>
-      <w:proofErr w:type="gramStart"/>
-      <w:r>
-        <w:t>more easy</w:t>
-      </w:r>
-      <w:proofErr w:type="gramEnd"/>
-      <w:r>
-        <w:t>. Help me brainstorm this out to make it my own thing.</w:t>
+        <w:t>How do we make it super easy with a wizard for someone to set up a) the single point it connects to (Open brain, but let's make it agnostic) b) the multiple solutions that will connect to it? We want to make sure it accepts 0Auth, API Key, None, Etc. we want it to be super simple to set up or update without have to open notepad. We want to be able to customize what it "talks to". It will features a really cool terminal view that will use different colors to show the different things connecting to it with colors for successful and failed communications. It will auto queue requests so they wait in line until another request is completed. It will create different log files for each thing trying to connect to make troubleshooting errors more easy. Help me brainstorm this out to make it my own thing.</w:t>
       </w:r>
       <w:r>
         <w:br/>
@@ -1703,6 +1215,7 @@
           <w:b/>
           <w:bCs/>
         </w:rPr>
+        <w:lastRenderedPageBreak/>
         <w:t>The Tool:</w:t>
       </w:r>
       <w:r>
@@ -1744,15 +1257,7 @@
         <w:t>How it works:</w:t>
       </w:r>
       <w:r>
-        <w:t xml:space="preserve"> When a user </w:t>
-      </w:r>
-      <w:proofErr w:type="gramStart"/>
-      <w:r>
-        <w:t>types</w:t>
-      </w:r>
-      <w:proofErr w:type="gramEnd"/>
-      <w:r>
-        <w:t xml:space="preserve"> node start.js --setup, the application clears the terminal and asks interactive questions:</w:t>
+        <w:t xml:space="preserve"> When a user types node start.js --setup, the application clears the terminal and asks interactive questions:</w:t>
       </w:r>
     </w:p>
     <w:p>
@@ -1767,55 +1272,7 @@
           <w:i/>
           <w:iCs/>
         </w:rPr>
-        <w:t xml:space="preserve">"What is the destination name? (e.g., </w:t>
-      </w:r>
-      <w:proofErr w:type="spellStart"/>
-      <w:r>
-        <w:rPr>
-          <w:i/>
-          <w:iCs/>
-        </w:rPr>
-        <w:t>OpenBrain</w:t>
-      </w:r>
-      <w:proofErr w:type="spellEnd"/>
-      <w:r>
-        <w:rPr>
-          <w:i/>
-          <w:iCs/>
-        </w:rPr>
-        <w:t xml:space="preserve">, </w:t>
-      </w:r>
-      <w:proofErr w:type="spellStart"/>
-      <w:r>
-        <w:rPr>
-          <w:i/>
-          <w:iCs/>
-        </w:rPr>
-        <w:t>Supabase</w:t>
-      </w:r>
-      <w:proofErr w:type="spellEnd"/>
-      <w:r>
-        <w:rPr>
-          <w:i/>
-          <w:iCs/>
-        </w:rPr>
-        <w:t xml:space="preserve">, </w:t>
-      </w:r>
-      <w:proofErr w:type="spellStart"/>
-      <w:r>
-        <w:rPr>
-          <w:i/>
-          <w:iCs/>
-        </w:rPr>
-        <w:t>MyDatabase</w:t>
-      </w:r>
-      <w:proofErr w:type="spellEnd"/>
-      <w:r>
-        <w:rPr>
-          <w:i/>
-          <w:iCs/>
-        </w:rPr>
-        <w:t>)"</w:t>
+        <w:t>"What is the destination name? (e.g., OpenBrain, Supabase, MyDatabase)"</w:t>
       </w:r>
     </w:p>
     <w:p>
@@ -1855,40 +1312,15 @@
           <w:numId w:val="10"/>
         </w:numPr>
       </w:pPr>
-      <w:proofErr w:type="gramStart"/>
-      <w:r>
-        <w:rPr>
-          <w:b/>
-          <w:bCs/>
-        </w:rPr>
-        <w:t>The Magic</w:t>
-      </w:r>
-      <w:proofErr w:type="gramEnd"/>
-      <w:r>
-        <w:rPr>
-          <w:b/>
-          <w:bCs/>
-        </w:rPr>
-        <w:t>:</w:t>
-      </w:r>
-      <w:r>
-        <w:t xml:space="preserve"> As the user answers these questions, your Node.js app silently writes their answers to a </w:t>
-      </w:r>
-      <w:proofErr w:type="gramStart"/>
-      <w:r>
-        <w:t>hidden .env</w:t>
-      </w:r>
-      <w:proofErr w:type="gramEnd"/>
-      <w:r>
-        <w:t xml:space="preserve"> or </w:t>
-      </w:r>
-      <w:proofErr w:type="spellStart"/>
-      <w:r>
-        <w:t>config.json</w:t>
-      </w:r>
-      <w:proofErr w:type="spellEnd"/>
-      <w:r>
-        <w:t xml:space="preserve"> file in the background. The next time the app boots, it just reads that file. No notepad required.</w:t>
+      <w:r>
+        <w:rPr>
+          <w:b/>
+          <w:bCs/>
+        </w:rPr>
+        <w:t>The Magic:</w:t>
+      </w:r>
+      <w:r>
+        <w:t xml:space="preserve"> As the user answers these questions, your Node.js app silently writes their answers to a hidden .env or config.json file in the background. The next time the app boots, it just reads that file. No notepad required.</w:t>
       </w:r>
     </w:p>
     <w:p>
@@ -1919,7 +1351,6 @@
         </w:numPr>
       </w:pPr>
       <w:r>
-        <w:lastRenderedPageBreak/>
         <w:t xml:space="preserve">Instead of hardcoding auth, your setup wizard saves the </w:t>
       </w:r>
       <w:r>
@@ -1952,23 +1383,7 @@
         </w:numPr>
       </w:pPr>
       <w:r>
-        <w:t xml:space="preserve">If the profile </w:t>
-      </w:r>
-      <w:proofErr w:type="gramStart"/>
-      <w:r>
-        <w:t>says</w:t>
-      </w:r>
-      <w:proofErr w:type="gramEnd"/>
-      <w:r>
-        <w:t xml:space="preserve"> "Requires API Key," your app checks the incoming header for Authorization: Bearer &lt;key&gt;. If it says "None," it lets it right through. This makes adding a new tool later as simple as running </w:t>
-      </w:r>
-      <w:proofErr w:type="gramStart"/>
-      <w:r>
-        <w:t>the setup</w:t>
-      </w:r>
-      <w:proofErr w:type="gramEnd"/>
-      <w:r>
-        <w:t xml:space="preserve"> wizard again and selecting "Add new source."</w:t>
+        <w:t>If the profile says "Requires API Key," your app checks the incoming header for Authorization: Bearer &lt;key&gt;. If it says "None," it lets it right through. This makes adding a new tool later as simple as running the setup wizard again and selecting "Add new source."</w:t>
       </w:r>
     </w:p>
     <w:p>
@@ -2038,7 +1453,6 @@
       <w:r>
         <w:t xml:space="preserve"> (which lets you build terminal UIs using React components) or </w:t>
       </w:r>
-      <w:proofErr w:type="gramStart"/>
       <w:r>
         <w:rPr>
           <w:b/>
@@ -2046,17 +1460,8 @@
         </w:rPr>
         <w:t>Blessed</w:t>
       </w:r>
-      <w:proofErr w:type="gramEnd"/>
-      <w:r>
-        <w:t xml:space="preserve"> to create actual visual boxes and </w:t>
-      </w:r>
-      <w:proofErr w:type="gramStart"/>
-      <w:r>
-        <w:t>split-screens</w:t>
-      </w:r>
-      <w:proofErr w:type="gramEnd"/>
-      <w:r>
-        <w:t xml:space="preserve"> in the terminal.</w:t>
+      <w:r>
+        <w:t xml:space="preserve"> to create actual visual boxes and split-screens in the terminal.</w:t>
       </w:r>
     </w:p>
     <w:p>
@@ -2085,6 +1490,7 @@
         </w:numPr>
       </w:pPr>
       <w:r>
+        <w:lastRenderedPageBreak/>
         <w:t>Below it, a live scrolling feed:</w:t>
       </w:r>
     </w:p>
@@ -2138,15 +1544,7 @@
     </w:p>
     <w:p>
       <w:r>
-        <w:t xml:space="preserve">Node.js naturally </w:t>
-      </w:r>
-      <w:proofErr w:type="gramStart"/>
-      <w:r>
-        <w:t>tries</w:t>
-      </w:r>
-      <w:proofErr w:type="gramEnd"/>
-      <w:r>
-        <w:t xml:space="preserve"> to do everything at once. If three AI models hit your hub simultaneously, it will try to write to your database three times at once, which can cause race conditions or rate limits.</w:t>
+        <w:t>Node.js naturally tries to do everything at once. If three AI models hit your hub simultaneously, it will try to write to your database three times at once, which can cause race conditions or rate limits.</w:t>
       </w:r>
     </w:p>
     <w:p>
@@ -2166,8 +1564,6 @@
       <w:r>
         <w:t xml:space="preserve"> You need a concurrency manager like </w:t>
       </w:r>
-      <w:proofErr w:type="spellStart"/>
-      <w:proofErr w:type="gramStart"/>
       <w:r>
         <w:rPr>
           <w:b/>
@@ -2175,29 +1571,15 @@
         </w:rPr>
         <w:t>async.queue</w:t>
       </w:r>
-      <w:proofErr w:type="spellEnd"/>
-      <w:proofErr w:type="gramEnd"/>
-      <w:r>
-        <w:t xml:space="preserve"> </w:t>
-      </w:r>
-      <w:proofErr w:type="gramStart"/>
-      <w:r>
-        <w:t xml:space="preserve">or </w:t>
-      </w:r>
-      <w:r>
-        <w:rPr>
-          <w:b/>
-          <w:bCs/>
-        </w:rPr>
-        <w:t>p</w:t>
-      </w:r>
-      <w:proofErr w:type="gramEnd"/>
-      <w:r>
-        <w:rPr>
-          <w:b/>
-          <w:bCs/>
-        </w:rPr>
-        <w:t>-queue</w:t>
+      <w:r>
+        <w:t xml:space="preserve"> or </w:t>
+      </w:r>
+      <w:r>
+        <w:rPr>
+          <w:b/>
+          <w:bCs/>
+        </w:rPr>
+        <w:t>p-queue</w:t>
       </w:r>
       <w:r>
         <w:t>.</w:t>
@@ -2243,7 +1625,6 @@
           <w:b/>
           <w:bCs/>
         </w:rPr>
-        <w:lastRenderedPageBreak/>
         <w:t>5. Isolated Logging for Easy Troubleshooting</w:t>
       </w:r>
     </w:p>
@@ -2295,23 +1676,7 @@
         <w:t>How it works:</w:t>
       </w:r>
       <w:r>
-        <w:t xml:space="preserve"> You configure Winston to create dynamic </w:t>
-      </w:r>
-      <w:proofErr w:type="gramStart"/>
-      <w:r>
-        <w:t>file</w:t>
-      </w:r>
-      <w:proofErr w:type="gramEnd"/>
-      <w:r>
-        <w:t xml:space="preserve"> </w:t>
-      </w:r>
-      <w:proofErr w:type="gramStart"/>
-      <w:r>
-        <w:t>transports</w:t>
-      </w:r>
-      <w:proofErr w:type="gramEnd"/>
-      <w:r>
-        <w:t>. When your app processes a request, it checks the source name.</w:t>
+        <w:t xml:space="preserve"> You configure Winston to create dynamic file transports. When your app processes a request, it checks the source name.</w:t>
       </w:r>
     </w:p>
     <w:p>
@@ -2344,21 +1709,13 @@
         </w:numPr>
       </w:pPr>
       <w:r>
-        <w:t xml:space="preserve">The terminal shows </w:t>
-      </w:r>
-      <w:proofErr w:type="gramStart"/>
-      <w:r>
-        <w:t>the</w:t>
-      </w:r>
-      <w:proofErr w:type="gramEnd"/>
-      <w:r>
-        <w:t xml:space="preserve"> clean, color-coded summary, but the deep, highly technical error data is neatly organized in separate files for the developer to review later.</w:t>
+        <w:t>The terminal shows the clean, color-coded summary, but the deep, highly technical error data is neatly organized in separate files for the developer to review later.</w:t>
       </w:r>
     </w:p>
     <w:p>
       <w:r>
         <w:pict w14:anchorId="19AFB040">
-          <v:rect id="_x0000_i1053" style="width:0;height:1.5pt" o:hralign="center" o:hrstd="t" o:hrnoshade="t" o:hr="t" fillcolor="gray" stroked="f"/>
+          <v:rect id="_x0000_i1026" style="width:0;height:1.5pt" o:hralign="center" o:hrstd="t" o:hrnoshade="t" o:hr="t" fillcolor="gray" stroked="f"/>
         </w:pict>
       </w:r>
     </w:p>
@@ -2394,6 +1751,7 @@
           <w:b/>
           <w:bCs/>
         </w:rPr>
+        <w:lastRenderedPageBreak/>
         <w:t>Nexus-Router</w:t>
       </w:r>
       <w:r>
@@ -2407,7 +1765,6 @@
           <w:numId w:val="15"/>
         </w:numPr>
       </w:pPr>
-      <w:proofErr w:type="spellStart"/>
       <w:r>
         <w:rPr>
           <w:b/>
@@ -2415,7 +1772,6 @@
         </w:rPr>
         <w:t>OmniNode</w:t>
       </w:r>
-      <w:proofErr w:type="spellEnd"/>
     </w:p>
     <w:p>
       <w:pPr>
@@ -2424,7 +1780,6 @@
           <w:numId w:val="15"/>
         </w:numPr>
       </w:pPr>
-      <w:proofErr w:type="spellStart"/>
       <w:r>
         <w:rPr>
           <w:b/>
@@ -2432,7 +1787,6 @@
         </w:rPr>
         <w:t>AeroGate</w:t>
       </w:r>
-      <w:proofErr w:type="spellEnd"/>
       <w:r>
         <w:t xml:space="preserve"> (An AI Gateway)</w:t>
       </w:r>
@@ -2444,7 +1798,6 @@
           <w:numId w:val="15"/>
         </w:numPr>
       </w:pPr>
-      <w:proofErr w:type="spellStart"/>
       <w:r>
         <w:rPr>
           <w:b/>
@@ -2452,19 +1805,10 @@
         </w:rPr>
         <w:t>CognitiveSwitch</w:t>
       </w:r>
-      <w:proofErr w:type="spellEnd"/>
-    </w:p>
-    <w:p>
-      <w:r>
-        <w:t xml:space="preserve">Would you like me to draft the Inquirer.js code for the interactive setup wizard so you can see exactly how we capture the user's </w:t>
-      </w:r>
-      <w:proofErr w:type="gramStart"/>
-      <w:r>
-        <w:t>inputs</w:t>
-      </w:r>
-      <w:proofErr w:type="gramEnd"/>
-      <w:r>
-        <w:t xml:space="preserve"> without them opening a file?</w:t>
+    </w:p>
+    <w:p>
+      <w:r>
+        <w:t>Would you like me to draft the Inquirer.js code for the interactive setup wizard so you can see exactly how we capture the user's inputs without them opening a file?</w:t>
       </w:r>
     </w:p>
     <w:p>
@@ -2473,15 +1817,7 @@
         <w:t xml:space="preserve">Shawn: </w:t>
       </w:r>
       <w:r>
-        <w:t xml:space="preserve">What about </w:t>
-      </w:r>
-      <w:proofErr w:type="spellStart"/>
-      <w:r>
-        <w:t>AutoGate</w:t>
-      </w:r>
-      <w:proofErr w:type="spellEnd"/>
-      <w:r>
-        <w:t>? Or are there better names?</w:t>
+        <w:t>What about AutoGate? Or are there better names?</w:t>
       </w:r>
       <w:r>
         <w:br/>
@@ -2490,40 +1826,12 @@
         <w:br/>
       </w:r>
       <w:r>
-        <w:t>"</w:t>
-      </w:r>
-      <w:proofErr w:type="spellStart"/>
-      <w:r>
-        <w:t>AutoGate</w:t>
-      </w:r>
-      <w:proofErr w:type="spellEnd"/>
-      <w:r>
-        <w:t xml:space="preserve">" is incredibly clean and </w:t>
-      </w:r>
-      <w:proofErr w:type="gramStart"/>
-      <w:r>
-        <w:t>definitely gets</w:t>
-      </w:r>
-      <w:proofErr w:type="gramEnd"/>
-      <w:r>
-        <w:t xml:space="preserve"> the point across—it immediately tells people it is an automated gateway.</w:t>
-      </w:r>
-    </w:p>
-    <w:p>
-      <w:r>
-        <w:t>To be completely candid, though, its main drawback is that it shares a name with the physical security industry. If you Google "</w:t>
-      </w:r>
-      <w:proofErr w:type="spellStart"/>
-      <w:r>
-        <w:t>AutoGate</w:t>
-      </w:r>
-      <w:proofErr w:type="spellEnd"/>
-      <w:r>
-        <w:t xml:space="preserve">," you are going to see a lot of industrial driveway gates, barrier arms, and access control systems for parking lots. If you want this </w:t>
-      </w:r>
-      <w:r>
-        <w:lastRenderedPageBreak/>
-        <w:t>to stand out on GitHub or a resume, you might want something that sounds a bit more native to the software and AI space.</w:t>
+        <w:t>"AutoGate" is incredibly clean and definitely gets the point across—it immediately tells people it is an automated gateway.</w:t>
+      </w:r>
+    </w:p>
+    <w:p>
+      <w:r>
+        <w:t>To be completely candid, though, its main drawback is that it shares a name with the physical security industry. If you Google "AutoGate," you are going to see a lot of industrial driveway gates, barrier arms, and access control systems for parking lots. If you want this to stand out on GitHub or a resume, you might want something that sounds a bit more native to the software and AI space.</w:t>
       </w:r>
     </w:p>
     <w:p>
@@ -2566,15 +1874,7 @@
         <w:t>Manifold.js:</w:t>
       </w:r>
       <w:r>
-        <w:t xml:space="preserve"> A manifold is the part of an engine that supplies the air/fuel mixture to the </w:t>
-      </w:r>
-      <w:proofErr w:type="gramStart"/>
-      <w:r>
-        <w:t>cylinders, or</w:t>
-      </w:r>
-      <w:proofErr w:type="gramEnd"/>
-      <w:r>
-        <w:t xml:space="preserve"> collects the exhaust from multiple cylinders into one pipe. It is the perfect physical analogy for routing multiple AI agents into a single database.</w:t>
+        <w:t xml:space="preserve"> A manifold is the part of an engine that supplies the air/fuel mixture to the cylinders, or collects the exhaust from multiple cylinders into one pipe. It is the perfect physical analogy for routing multiple AI agents into a single database.</w:t>
       </w:r>
     </w:p>
     <w:p>
@@ -2584,21 +1884,12 @@
           <w:numId w:val="16"/>
         </w:numPr>
       </w:pPr>
-      <w:proofErr w:type="spellStart"/>
-      <w:r>
-        <w:rPr>
-          <w:b/>
-          <w:bCs/>
-        </w:rPr>
-        <w:t>ThrottleNode</w:t>
-      </w:r>
-      <w:proofErr w:type="spellEnd"/>
-      <w:r>
-        <w:rPr>
-          <w:b/>
-          <w:bCs/>
-        </w:rPr>
-        <w:t>:</w:t>
+      <w:r>
+        <w:rPr>
+          <w:b/>
+          <w:bCs/>
+        </w:rPr>
+        <w:t>ThrottleNode:</w:t>
       </w:r>
       <w:r>
         <w:t xml:space="preserve"> Implies control, flow management, and speed—perfect for a system that queues and paces API requests.</w:t>
@@ -2611,32 +1902,15 @@
           <w:numId w:val="16"/>
         </w:numPr>
       </w:pPr>
-      <w:proofErr w:type="spellStart"/>
-      <w:r>
-        <w:rPr>
-          <w:b/>
-          <w:bCs/>
-        </w:rPr>
-        <w:t>ApexRouter</w:t>
-      </w:r>
-      <w:proofErr w:type="spellEnd"/>
-      <w:r>
-        <w:rPr>
-          <w:b/>
-          <w:bCs/>
-        </w:rPr>
-        <w:t>:</w:t>
-      </w:r>
-      <w:r>
-        <w:t xml:space="preserve"> Hitting the apex is about taking the most efficient, precise path through a curve. It sounds sharp and </w:t>
-      </w:r>
-      <w:proofErr w:type="gramStart"/>
-      <w:r>
-        <w:t>performance-oriented</w:t>
-      </w:r>
-      <w:proofErr w:type="gramEnd"/>
-      <w:r>
-        <w:t>.</w:t>
+      <w:r>
+        <w:rPr>
+          <w:b/>
+          <w:bCs/>
+        </w:rPr>
+        <w:t>ApexRouter:</w:t>
+      </w:r>
+      <w:r>
+        <w:t xml:space="preserve"> Hitting the apex is about taking the most efficient, precise path through a curve. It sounds sharp and performance-oriented.</w:t>
       </w:r>
     </w:p>
     <w:p>
@@ -2671,6 +1945,7 @@
           <w:b/>
           <w:bCs/>
         </w:rPr>
+        <w:lastRenderedPageBreak/>
         <w:t>Cortex.js:</w:t>
       </w:r>
       <w:r>
@@ -2684,21 +1959,12 @@
           <w:numId w:val="17"/>
         </w:numPr>
       </w:pPr>
-      <w:proofErr w:type="spellStart"/>
-      <w:r>
-        <w:rPr>
-          <w:b/>
-          <w:bCs/>
-        </w:rPr>
-        <w:t>SynapseHub</w:t>
-      </w:r>
-      <w:proofErr w:type="spellEnd"/>
-      <w:r>
-        <w:rPr>
-          <w:b/>
-          <w:bCs/>
-        </w:rPr>
-        <w:t>:</w:t>
+      <w:r>
+        <w:rPr>
+          <w:b/>
+          <w:bCs/>
+        </w:rPr>
+        <w:t>SynapseHub:</w:t>
       </w:r>
       <w:r>
         <w:t xml:space="preserve"> The exact point where different neurons connect and pass signals to each other.</w:t>
@@ -2711,21 +1977,12 @@
           <w:numId w:val="17"/>
         </w:numPr>
       </w:pPr>
-      <w:proofErr w:type="spellStart"/>
-      <w:r>
-        <w:rPr>
-          <w:b/>
-          <w:bCs/>
-        </w:rPr>
-        <w:t>AgentMesh</w:t>
-      </w:r>
-      <w:proofErr w:type="spellEnd"/>
-      <w:r>
-        <w:rPr>
-          <w:b/>
-          <w:bCs/>
-        </w:rPr>
-        <w:t>:</w:t>
+      <w:r>
+        <w:rPr>
+          <w:b/>
+          <w:bCs/>
+        </w:rPr>
+        <w:t>AgentMesh:</w:t>
       </w:r>
       <w:r>
         <w:t xml:space="preserve"> "Mesh" implies a decentralized network coming together, and "Agent" clearly flags this as an AI-focused tool.</w:t>
@@ -2758,21 +2015,12 @@
           <w:numId w:val="18"/>
         </w:numPr>
       </w:pPr>
-      <w:proofErr w:type="spellStart"/>
-      <w:r>
-        <w:rPr>
-          <w:b/>
-          <w:bCs/>
-        </w:rPr>
-        <w:t>ChromaGate</w:t>
-      </w:r>
-      <w:proofErr w:type="spellEnd"/>
-      <w:r>
-        <w:rPr>
-          <w:b/>
-          <w:bCs/>
-        </w:rPr>
-        <w:t>:</w:t>
+      <w:r>
+        <w:rPr>
+          <w:b/>
+          <w:bCs/>
+        </w:rPr>
+        <w:t>ChromaGate:</w:t>
       </w:r>
       <w:r>
         <w:t xml:space="preserve"> "Chroma" points to the color-coded terminal UI you want to build.</w:t>
@@ -2785,21 +2033,12 @@
           <w:numId w:val="18"/>
         </w:numPr>
       </w:pPr>
-      <w:proofErr w:type="spellStart"/>
-      <w:r>
-        <w:rPr>
-          <w:b/>
-          <w:bCs/>
-        </w:rPr>
-        <w:t>OmniLog</w:t>
-      </w:r>
-      <w:proofErr w:type="spellEnd"/>
-      <w:r>
-        <w:rPr>
-          <w:b/>
-          <w:bCs/>
-        </w:rPr>
-        <w:t>:</w:t>
+      <w:r>
+        <w:rPr>
+          <w:b/>
+          <w:bCs/>
+        </w:rPr>
+        <w:t>OmniLog:</w:t>
       </w:r>
       <w:r>
         <w:t xml:space="preserve"> Highlights the universal connection and deep logging capabilities.</w:t>
@@ -2812,21 +2051,12 @@
           <w:numId w:val="18"/>
         </w:numPr>
       </w:pPr>
-      <w:proofErr w:type="spellStart"/>
-      <w:r>
-        <w:rPr>
-          <w:b/>
-          <w:bCs/>
-        </w:rPr>
-        <w:t>NexusCLI</w:t>
-      </w:r>
-      <w:proofErr w:type="spellEnd"/>
-      <w:r>
-        <w:rPr>
-          <w:b/>
-          <w:bCs/>
-        </w:rPr>
-        <w:t>:</w:t>
+      <w:r>
+        <w:rPr>
+          <w:b/>
+          <w:bCs/>
+        </w:rPr>
+        <w:t>NexusCLI:</w:t>
       </w:r>
       <w:r>
         <w:t xml:space="preserve"> Straightforward, enterprise-friendly, and sounds like a professional developer tool.</w:t>
@@ -2838,362 +2068,197 @@
           <w:b/>
           <w:bCs/>
         </w:rPr>
+        <w:t>Manifold.js</w:t>
+      </w:r>
+      <w:r>
+        <w:t xml:space="preserve"> or </w:t>
+      </w:r>
+      <w:r>
+        <w:rPr>
+          <w:b/>
+          <w:bCs/>
+        </w:rPr>
+        <w:t>Cortex.js</w:t>
+      </w:r>
+      <w:r>
+        <w:t xml:space="preserve"> probably pack the most punch for what you are building. They sound like serious, open-source orchestration tools that a company would actually adopt.</w:t>
+      </w:r>
+    </w:p>
+    <w:p>
+      <w:r>
+        <w:t>Which of those directions feels the closest to your vision for the tool? Once we lock in a vibe, would you like me to draft the Inquirer.js setup wizard code so we can see how the terminal interactions will actually look?</w:t>
+      </w:r>
+    </w:p>
+    <w:p>
+      <w:r>
+        <w:br/>
+        <w:t>Shawn: Okay, let's just call it BubbleFish for now as our Project name.  Let's focus on design.  I want to work out more design ideas for this.  LET'S BRAINSTORM ON THIS AND CREATE SOMETHING NEW, NOT BORROW FROM OTHER PEOPLE.  WE CAN REFER TO OPENSOURCE LIBRARIES, BUT I WANT BUBBLEFISH TO ME MY VERY OWN CREATION AND NOT HAVE TO CITE ANYONE ELSE FOR IT.</w:t>
+      </w:r>
+    </w:p>
+    <w:p>
+      <w:r>
+        <w:t>Guidelines: Enterprise grade, but lightweight, lightening fast.  Cool terminal with colors.  Make it look like Frontier CLI's.  Must consider anything that can go wrong.  This needs to be streamlined, easy to use, have a queue so it doesn't overload the database or cause any apps to crash.</w:t>
+      </w:r>
+    </w:p>
+    <w:p>
+      <w:r>
+        <w:t xml:space="preserve">A concern: If we use a wizard to take command  descriptions of what it needs to do, it leaves a lot of room for things to break.  </w:t>
+      </w:r>
+    </w:p>
+    <w:p>
+      <w:r>
+        <w:t xml:space="preserve">What if: </w:t>
+      </w:r>
+    </w:p>
+    <w:p>
+      <w:r>
         <w:lastRenderedPageBreak/>
-        <w:t>Manifold.js</w:t>
-      </w:r>
-      <w:r>
-        <w:t xml:space="preserve"> or </w:t>
-      </w:r>
-      <w:r>
-        <w:rPr>
-          <w:b/>
-          <w:bCs/>
-        </w:rPr>
-        <w:t>Cortex.js</w:t>
-      </w:r>
-      <w:r>
-        <w:t xml:space="preserve"> probably pack the most punch for what you are building. They sound like serious, open-source orchestration tools that a company would </w:t>
-      </w:r>
-      <w:proofErr w:type="gramStart"/>
-      <w:r>
-        <w:t>actually adopt</w:t>
-      </w:r>
-      <w:proofErr w:type="gramEnd"/>
+        <w:t>What if we design it so that</w:t>
+      </w:r>
+    </w:p>
+    <w:p>
+      <w:r>
+        <w:t>Source = Applications you want to connect (i.e. Claude, ChatGPT, Perplexity Comet.)</w:t>
+      </w:r>
+    </w:p>
+    <w:p>
+      <w:r>
+        <w:t xml:space="preserve">Destination = The one source you want them to connect tp (i.e. OpenBrain, </w:t>
+      </w:r>
+    </w:p>
+    <w:p>
+      <w:r>
+        <w:t>Would it be easier if the setup wizard creates a folder structure with a "Apps" folder.</w:t>
+      </w:r>
+    </w:p>
+    <w:p>
+      <w:r>
+        <w:t>1) You create a folder for each App</w:t>
+      </w:r>
+    </w:p>
+    <w:p>
+      <w:r>
+        <w:t>2) drop whatever files are pertinent like json or whatever</w:t>
+      </w:r>
+    </w:p>
+    <w:p>
+      <w:r>
+        <w:t>Then a "Persona_Destination" folder</w:t>
+      </w:r>
+    </w:p>
+    <w:p>
+      <w:r>
+        <w:t>1) You drop whatever files are pertinent to connecting to the Destination (i.e. Openbrain)</w:t>
+      </w:r>
+    </w:p>
+    <w:p>
+      <w:r>
+        <w:t>Then we build an MCP/CLI Translator that makes {appname.translated} file for each app</w:t>
+      </w:r>
+    </w:p>
+    <w:p>
+      <w:r>
+        <w:t>1) You run a "Build_Translations" script or something</w:t>
+      </w:r>
+    </w:p>
+    <w:p>
+      <w:r>
+        <w:t>2) When you run it, it looks at the Destination Files, then looks at each App folder</w:t>
+      </w:r>
+    </w:p>
+    <w:p>
+      <w:r>
+        <w:t>3) It builds a new file type {appname.translated} so that each app knows how to communicate with the server, so it gets translated and can communicate with the Destination App</w:t>
+      </w:r>
+      <w:r>
+        <w:br/>
+      </w:r>
+      <w:r>
+        <w:br/>
+      </w:r>
+      <w:r>
+        <w:t>BubbleFish is a fantastic working title, and your instinct to pivot away from a purely conversational setup wizard is dead-on for an enterprise-grade tool.</w:t>
+      </w:r>
+    </w:p>
+    <w:p>
+      <w:r>
+        <w:t>You are completely right: wizards are great for consumer apps, but when you are orchestrating data pipelines, typing instructions leaves too much room for human error, typos, and broken connections.</w:t>
+      </w:r>
+    </w:p>
+    <w:p>
+      <w:r>
+        <w:t xml:space="preserve">What you just invented is a variation of </w:t>
+      </w:r>
+      <w:r>
+        <w:rPr>
+          <w:b/>
+          <w:bCs/>
+        </w:rPr>
+        <w:t>"Infrastructure as Code" (IaC)</w:t>
+      </w:r>
+      <w:r>
+        <w:t xml:space="preserve"> combined with </w:t>
+      </w:r>
+      <w:r>
+        <w:rPr>
+          <w:b/>
+          <w:bCs/>
+        </w:rPr>
+        <w:t>"File-Based Routing"</w:t>
+      </w:r>
+      <w:r>
+        <w:t xml:space="preserve"> (similar to how modern frameworks like Next.js work). It is highly modular, easily version-controlled (you can push these folders to GitHub), and incredibly robust.</w:t>
+      </w:r>
+    </w:p>
+    <w:p>
+      <w:r>
+        <w:t>Let's refine this architecture to ensure it is entirely your own creation, lightning-fast, and doesn't rely on bloated third-party frameworks.</w:t>
+      </w:r>
+    </w:p>
+    <w:p>
+      <w:r>
+        <w:t xml:space="preserve">Here is how we engineer the </w:t>
+      </w:r>
+      <w:r>
+        <w:rPr>
+          <w:b/>
+          <w:bCs/>
+        </w:rPr>
+        <w:t>BubbleFish Compiler Architecture</w:t>
+      </w:r>
       <w:r>
         <w:t>.</w:t>
       </w:r>
     </w:p>
     <w:p>
-      <w:r>
-        <w:t xml:space="preserve">Which of those directions feels the closest to your vision for the tool? Once we lock in a vibe, would you like me to draft the Inquirer.js setup wizard code so we can see how the terminal interactions will </w:t>
-      </w:r>
-      <w:proofErr w:type="gramStart"/>
-      <w:r>
-        <w:t>actually look</w:t>
-      </w:r>
-      <w:proofErr w:type="gramEnd"/>
-      <w:r>
-        <w:t>?</w:t>
-      </w:r>
-    </w:p>
-    <w:p>
-      <w:r>
-        <w:br/>
-        <w:t xml:space="preserve">Shawn: </w:t>
-      </w:r>
-      <w:r>
-        <w:t xml:space="preserve">Okay, let's just call it </w:t>
-      </w:r>
-      <w:proofErr w:type="spellStart"/>
-      <w:r>
-        <w:t>BubbleFish</w:t>
-      </w:r>
-      <w:proofErr w:type="spellEnd"/>
-      <w:r>
-        <w:t xml:space="preserve"> for now as our Project name.  Let's focus on design.  I want to work out more design ideas for this.  LET'S BRAINSTORM ON THIS AND CREATE SOMETHING NEW, NOT BORROW FROM OTHER PEOPLE.  WE CAN REFER TO OPENSOURCE LIBRARIES, BUT I WANT BUBBLEFISH TO ME MY VERY OWN CREATION AND NOT HAVE TO CITE ANYONE ELSE FOR IT.</w:t>
-      </w:r>
-    </w:p>
-    <w:p>
-      <w:r>
-        <w:t xml:space="preserve">Guidelines: Enterprise grade, but lightweight, </w:t>
-      </w:r>
-      <w:proofErr w:type="spellStart"/>
-      <w:proofErr w:type="gramStart"/>
-      <w:r>
-        <w:t>lightening</w:t>
-      </w:r>
-      <w:proofErr w:type="spellEnd"/>
-      <w:proofErr w:type="gramEnd"/>
-      <w:r>
-        <w:t xml:space="preserve"> fast.  Cool terminal with colors.  Make it look like Frontier CLI's.  </w:t>
-      </w:r>
-      <w:proofErr w:type="gramStart"/>
-      <w:r>
-        <w:t>Must</w:t>
-      </w:r>
-      <w:proofErr w:type="gramEnd"/>
-      <w:r>
-        <w:t xml:space="preserve"> consider anything that can go wrong.  This needs to be streamlined, easy to use, have a queue so it doesn't overload the database or cause any apps to crash.</w:t>
-      </w:r>
-    </w:p>
-    <w:p>
-      <w:r>
-        <w:t xml:space="preserve">A concern: If we use a wizard to take </w:t>
-      </w:r>
-      <w:proofErr w:type="gramStart"/>
-      <w:r>
-        <w:t>command  descriptions</w:t>
-      </w:r>
-      <w:proofErr w:type="gramEnd"/>
-      <w:r>
-        <w:t xml:space="preserve"> of what it needs to do, it leaves a lot of room for things to break.  </w:t>
-      </w:r>
-    </w:p>
-    <w:p>
-      <w:r>
-        <w:t xml:space="preserve">What if: </w:t>
-      </w:r>
-    </w:p>
-    <w:p>
-      <w:r>
-        <w:t>What if we design it so that</w:t>
-      </w:r>
-    </w:p>
-    <w:p>
-      <w:r>
-        <w:t>Source = Applications you want to connect (i.e. Claude, ChatGPT, Perplexity Comet.)</w:t>
-      </w:r>
-    </w:p>
-    <w:p>
-      <w:r>
-        <w:t xml:space="preserve">Destination = The one source you want them to connect </w:t>
-      </w:r>
-      <w:proofErr w:type="spellStart"/>
-      <w:r>
-        <w:t>tp</w:t>
-      </w:r>
-      <w:proofErr w:type="spellEnd"/>
-      <w:r>
-        <w:t xml:space="preserve"> (i.e. </w:t>
-      </w:r>
-      <w:proofErr w:type="spellStart"/>
-      <w:r>
-        <w:t>OpenBrain</w:t>
-      </w:r>
-      <w:proofErr w:type="spellEnd"/>
-      <w:r>
-        <w:t xml:space="preserve">, </w:t>
-      </w:r>
-    </w:p>
-    <w:p>
-      <w:r>
-        <w:t xml:space="preserve">Would it be easier if the setup wizard creates a folder structure with </w:t>
-      </w:r>
-      <w:proofErr w:type="gramStart"/>
-      <w:r>
-        <w:t>a</w:t>
-      </w:r>
-      <w:proofErr w:type="gramEnd"/>
-      <w:r>
-        <w:t xml:space="preserve"> "Apps" folder.</w:t>
-      </w:r>
-    </w:p>
-    <w:p>
-      <w:r>
-        <w:t>1) You create a folder for each App</w:t>
-      </w:r>
-    </w:p>
-    <w:p>
-      <w:r>
-        <w:t xml:space="preserve">2) drop whatever files are pertinent like </w:t>
-      </w:r>
-      <w:proofErr w:type="spellStart"/>
-      <w:r>
-        <w:t>json</w:t>
-      </w:r>
-      <w:proofErr w:type="spellEnd"/>
-      <w:r>
-        <w:t xml:space="preserve"> or whatever</w:t>
-      </w:r>
-    </w:p>
-    <w:p>
-      <w:r>
-        <w:t>Then a "</w:t>
-      </w:r>
-      <w:proofErr w:type="spellStart"/>
-      <w:r>
-        <w:t>Persona_Destination</w:t>
-      </w:r>
-      <w:proofErr w:type="spellEnd"/>
-      <w:r>
-        <w:t>" folder</w:t>
-      </w:r>
-    </w:p>
-    <w:p>
-      <w:r>
-        <w:t xml:space="preserve">1) You drop whatever files are pertinent to connecting to the Destination (i.e. </w:t>
-      </w:r>
-      <w:proofErr w:type="spellStart"/>
-      <w:r>
-        <w:t>Openbrain</w:t>
-      </w:r>
-      <w:proofErr w:type="spellEnd"/>
-      <w:r>
-        <w:t>)</w:t>
-      </w:r>
-    </w:p>
-    <w:p>
-      <w:r>
-        <w:t>Then we build an MCP/CLI Translator that makes {</w:t>
-      </w:r>
-      <w:proofErr w:type="spellStart"/>
-      <w:proofErr w:type="gramStart"/>
-      <w:r>
-        <w:t>appname.translated</w:t>
-      </w:r>
-      <w:proofErr w:type="spellEnd"/>
-      <w:proofErr w:type="gramEnd"/>
-      <w:r>
-        <w:t>} file for each app</w:t>
-      </w:r>
-    </w:p>
-    <w:p>
-      <w:r>
-        <w:t>1) You run a "</w:t>
-      </w:r>
-      <w:proofErr w:type="spellStart"/>
-      <w:r>
-        <w:t>Build_Translations</w:t>
-      </w:r>
-      <w:proofErr w:type="spellEnd"/>
-      <w:r>
-        <w:t>" script or something</w:t>
-      </w:r>
-    </w:p>
-    <w:p>
-      <w:r>
-        <w:t>2) When you run it, it looks at the Destination Files, then looks at each App folder</w:t>
+      <w:pPr>
+        <w:rPr>
+          <w:b/>
+          <w:bCs/>
+        </w:rPr>
+      </w:pPr>
+      <w:r>
+        <w:rPr>
+          <w:b/>
+          <w:bCs/>
+        </w:rPr>
+        <w:t>1. The Directory Structure (The "Drop Folders")</w:t>
+      </w:r>
+    </w:p>
+    <w:p>
+      <w:r>
+        <w:t>Instead of a wizard, the user interacts strictly with the file system. It’s clean and visual.</w:t>
       </w:r>
     </w:p>
     <w:p>
       <w:r>
         <w:lastRenderedPageBreak/>
-        <w:t>3) It builds a new file type {</w:t>
-      </w:r>
-      <w:proofErr w:type="spellStart"/>
-      <w:r>
-        <w:t>appname.translated</w:t>
-      </w:r>
-      <w:proofErr w:type="spellEnd"/>
-      <w:r>
-        <w:t>} so that each app knows how to communicate with the server, so it gets translated and can communicate with the Destination App</w:t>
-      </w:r>
-      <w:r>
-        <w:br/>
-      </w:r>
-      <w:r>
-        <w:br/>
-      </w:r>
-      <w:proofErr w:type="spellStart"/>
-      <w:r>
-        <w:t>BubbleFish</w:t>
-      </w:r>
-      <w:proofErr w:type="spellEnd"/>
-      <w:r>
-        <w:t xml:space="preserve"> is a fantastic working title, and your instinct to pivot away from a purely conversational setup wizard is dead-on for an enterprise-grade tool.</w:t>
-      </w:r>
-    </w:p>
-    <w:p>
-      <w:r>
-        <w:t>You are completely right: wizards are great for consumer apps, but when you are orchestrating data pipelines, typing instructions leaves too much room for human error, typos, and broken connections.</w:t>
-      </w:r>
-    </w:p>
-    <w:p>
-      <w:r>
-        <w:t xml:space="preserve">What you just invented is a variation of </w:t>
-      </w:r>
-      <w:r>
-        <w:rPr>
-          <w:b/>
-          <w:bCs/>
-        </w:rPr>
-        <w:t>"Infrastructure as Code" (</w:t>
-      </w:r>
-      <w:proofErr w:type="spellStart"/>
-      <w:r>
-        <w:rPr>
-          <w:b/>
-          <w:bCs/>
-        </w:rPr>
-        <w:t>IaC</w:t>
-      </w:r>
-      <w:proofErr w:type="spellEnd"/>
-      <w:r>
-        <w:rPr>
-          <w:b/>
-          <w:bCs/>
-        </w:rPr>
-        <w:t>)</w:t>
-      </w:r>
-      <w:r>
-        <w:t xml:space="preserve"> combined with </w:t>
-      </w:r>
-      <w:r>
-        <w:rPr>
-          <w:b/>
-          <w:bCs/>
-        </w:rPr>
-        <w:t>"File-Based Routing"</w:t>
-      </w:r>
-      <w:r>
-        <w:t xml:space="preserve"> (similar to how modern frameworks like Next.js work). It is highly modular, easily version-controlled (you can push these folders to GitHub), and incredibly robust.</w:t>
-      </w:r>
-    </w:p>
-    <w:p>
-      <w:r>
-        <w:t>Let's refine this architecture to ensure it is entirely your own creation, lightning-fast, and doesn't rely on bloated third-party frameworks.</w:t>
-      </w:r>
-    </w:p>
-    <w:p>
-      <w:r>
-        <w:t xml:space="preserve">Here is how we engineer the </w:t>
-      </w:r>
-      <w:proofErr w:type="spellStart"/>
-      <w:r>
-        <w:rPr>
-          <w:b/>
-          <w:bCs/>
-        </w:rPr>
-        <w:t>BubbleFish</w:t>
-      </w:r>
-      <w:proofErr w:type="spellEnd"/>
-      <w:r>
-        <w:rPr>
-          <w:b/>
-          <w:bCs/>
-        </w:rPr>
-        <w:t xml:space="preserve"> Compiler Architecture</w:t>
-      </w:r>
-      <w:r>
-        <w:t>.</w:t>
-      </w:r>
-    </w:p>
-    <w:p>
-      <w:pPr>
-        <w:rPr>
-          <w:b/>
-          <w:bCs/>
-        </w:rPr>
-      </w:pPr>
-      <w:r>
-        <w:rPr>
-          <w:b/>
-          <w:bCs/>
-        </w:rPr>
-        <w:t>1. The Directory Structure (The "Drop Folders")</w:t>
-      </w:r>
-    </w:p>
-    <w:p>
-      <w:r>
-        <w:t>Instead of a wizard, the user interacts strictly with the file system. It’s clean and visual.</w:t>
-      </w:r>
-    </w:p>
-    <w:p>
-      <w:r>
         <w:t>Plaintext</w:t>
       </w:r>
     </w:p>
     <w:p>
       <w:r>
-        <w:t>/</w:t>
-      </w:r>
-      <w:proofErr w:type="spellStart"/>
-      <w:r>
-        <w:t>bubblefish</w:t>
-      </w:r>
-      <w:proofErr w:type="spellEnd"/>
-      <w:r>
-        <w:t>-core</w:t>
+        <w:t>/bubblefish-core</w:t>
       </w:r>
     </w:p>
     <w:p>
@@ -3218,23 +2283,7 @@
     </w:p>
     <w:p>
       <w:r>
-        <w:t xml:space="preserve">  │    └── </w:t>
-      </w:r>
-      <w:proofErr w:type="spellStart"/>
-      <w:r>
-        <w:t>openbrain.json</w:t>
-      </w:r>
-      <w:proofErr w:type="spellEnd"/>
-      <w:r>
-        <w:t xml:space="preserve">         &lt;-- Defines what </w:t>
-      </w:r>
-      <w:proofErr w:type="spellStart"/>
-      <w:r>
-        <w:t>OpenBrain</w:t>
-      </w:r>
-      <w:proofErr w:type="spellEnd"/>
-      <w:r>
-        <w:t xml:space="preserve"> needs</w:t>
+        <w:t xml:space="preserve">  │    └── openbrain.json         &lt;-- Defines what OpenBrain needs</w:t>
       </w:r>
     </w:p>
     <w:p>
@@ -3274,34 +2323,13 @@
         <w:t>──</w:t>
       </w:r>
       <w:r>
-        <w:t xml:space="preserve"> </w:t>
-      </w:r>
-      <w:proofErr w:type="spellStart"/>
-      <w:r>
-        <w:t>claude</w:t>
-      </w:r>
-      <w:proofErr w:type="spellEnd"/>
-      <w:r>
-        <w:t>/</w:t>
-      </w:r>
-    </w:p>
-    <w:p>
-      <w:r>
-        <w:t xml:space="preserve">  │    │    └── </w:t>
-      </w:r>
-      <w:proofErr w:type="spellStart"/>
-      <w:r>
-        <w:t>mapping.json</w:t>
-      </w:r>
-      <w:proofErr w:type="spellEnd"/>
-      <w:r>
-        <w:t xml:space="preserve">      &lt;-- Defines how Claude connects to </w:t>
-      </w:r>
-      <w:proofErr w:type="spellStart"/>
-      <w:r>
-        <w:t>OpenBrain</w:t>
-      </w:r>
-      <w:proofErr w:type="spellEnd"/>
+        <w:t xml:space="preserve"> claude/</w:t>
+      </w:r>
+    </w:p>
+    <w:p>
+      <w:r>
+        <w:t xml:space="preserve">  │    │    └── mapping.json      &lt;-- Defines how Claude connects to OpenBrain</w:t>
+      </w:r>
     </w:p>
     <w:p>
       <w:r>
@@ -3325,15 +2353,7 @@
     </w:p>
     <w:p>
       <w:r>
-        <w:t xml:space="preserve">  │    │    └── </w:t>
-      </w:r>
-      <w:proofErr w:type="spellStart"/>
-      <w:r>
-        <w:t>mapping.json</w:t>
-      </w:r>
-      <w:proofErr w:type="spellEnd"/>
-      <w:r>
-        <w:t xml:space="preserve">      &lt;-- Defines how Perplexity connects</w:t>
+        <w:t xml:space="preserve">  │    │    └── mapping.json      &lt;-- Defines how Perplexity connects</w:t>
       </w:r>
     </w:p>
     <w:p>
@@ -3353,15 +2373,7 @@
         <w:t>──</w:t>
       </w:r>
       <w:r>
-        <w:t xml:space="preserve"> /compiled                   &lt;-- </w:t>
-      </w:r>
-      <w:proofErr w:type="spellStart"/>
-      <w:r>
-        <w:t>BubbleFish</w:t>
-      </w:r>
-      <w:proofErr w:type="spellEnd"/>
-      <w:r>
-        <w:t xml:space="preserve"> generates this folder automatically</w:t>
+        <w:t xml:space="preserve"> /compiled                   &lt;-- BubbleFish generates this folder automatically</w:t>
       </w:r>
     </w:p>
     <w:p>
@@ -3386,21 +2398,12 @@
     </w:p>
     <w:p>
       <w:r>
-        <w:lastRenderedPageBreak/>
         <w:t xml:space="preserve">  │    └── perplexity.translated.js</w:t>
       </w:r>
     </w:p>
     <w:p>
       <w:r>
-        <w:t xml:space="preserve">  └── build.js                    &lt;-- Your "</w:t>
-      </w:r>
-      <w:proofErr w:type="spellStart"/>
-      <w:r>
-        <w:t>Build_Translations</w:t>
-      </w:r>
-      <w:proofErr w:type="spellEnd"/>
-      <w:r>
-        <w:t>" script</w:t>
+        <w:t xml:space="preserve">  └── build.js                    &lt;-- Your "Build_Translations" script</w:t>
       </w:r>
     </w:p>
     <w:p>
@@ -3440,34 +2443,10 @@
           <w:b/>
           <w:bCs/>
         </w:rPr>
-        <w:t>The Destination (</w:t>
-      </w:r>
-      <w:proofErr w:type="spellStart"/>
-      <w:r>
-        <w:rPr>
-          <w:b/>
-          <w:bCs/>
-        </w:rPr>
-        <w:t>openbrain.json</w:t>
-      </w:r>
-      <w:proofErr w:type="spellEnd"/>
-      <w:r>
-        <w:rPr>
-          <w:b/>
-          <w:bCs/>
-        </w:rPr>
-        <w:t>):</w:t>
-      </w:r>
-      <w:r>
-        <w:t xml:space="preserve"> This file simply lists the "keys" that your </w:t>
-      </w:r>
-      <w:proofErr w:type="spellStart"/>
-      <w:r>
-        <w:t>Supabase</w:t>
-      </w:r>
-      <w:proofErr w:type="spellEnd"/>
-      <w:r>
-        <w:t xml:space="preserve"> database requires.</w:t>
+        <w:t>The Destination (openbrain.json):</w:t>
+      </w:r>
+      <w:r>
+        <w:t xml:space="preserve"> This file simply lists the "keys" that your Supabase database requires.</w:t>
       </w:r>
     </w:p>
     <w:p>
@@ -3485,31 +2464,7 @@
         <w:t>Example:</w:t>
       </w:r>
       <w:r>
-        <w:t xml:space="preserve"> ["</w:t>
-      </w:r>
-      <w:proofErr w:type="spellStart"/>
-      <w:r>
-        <w:t>author_name</w:t>
-      </w:r>
-      <w:proofErr w:type="spellEnd"/>
-      <w:r>
-        <w:t>", "</w:t>
-      </w:r>
-      <w:proofErr w:type="spellStart"/>
-      <w:r>
-        <w:t>ai_model</w:t>
-      </w:r>
-      <w:proofErr w:type="spellEnd"/>
-      <w:r>
-        <w:t>", "</w:t>
-      </w:r>
-      <w:proofErr w:type="spellStart"/>
-      <w:r>
-        <w:t>raw_content</w:t>
-      </w:r>
-      <w:proofErr w:type="spellEnd"/>
-      <w:r>
-        <w:t>", "timestamp"]</w:t>
+        <w:t xml:space="preserve"> ["author_name", "ai_model", "raw_content", "timestamp"]</w:t>
       </w:r>
     </w:p>
     <w:p>
@@ -3524,42 +2479,10 @@
           <w:b/>
           <w:bCs/>
         </w:rPr>
-        <w:t>The Sources (</w:t>
-      </w:r>
-      <w:proofErr w:type="spellStart"/>
-      <w:r>
-        <w:rPr>
-          <w:b/>
-          <w:bCs/>
-        </w:rPr>
-        <w:t>mapping.json</w:t>
-      </w:r>
-      <w:proofErr w:type="spellEnd"/>
-      <w:r>
-        <w:rPr>
-          <w:b/>
-          <w:bCs/>
-        </w:rPr>
-        <w:t>):</w:t>
-      </w:r>
-      <w:r>
-        <w:t xml:space="preserve"> In the Claude folder, this file tells </w:t>
-      </w:r>
-      <w:proofErr w:type="spellStart"/>
-      <w:r>
-        <w:t>BubbleFish</w:t>
-      </w:r>
-      <w:proofErr w:type="spellEnd"/>
-      <w:r>
-        <w:t xml:space="preserve"> how to map Claude's specific API output to </w:t>
-      </w:r>
-      <w:proofErr w:type="spellStart"/>
-      <w:r>
-        <w:t>OpenBrain's</w:t>
-      </w:r>
-      <w:proofErr w:type="spellEnd"/>
-      <w:r>
-        <w:t xml:space="preserve"> required keys.</w:t>
+        <w:t>The Sources (mapping.json):</w:t>
+      </w:r>
+      <w:r>
+        <w:t xml:space="preserve"> In the Claude folder, this file tells BubbleFish how to map Claude's specific API output to OpenBrain's required keys.</w:t>
       </w:r>
     </w:p>
     <w:p>
@@ -3577,23 +2500,7 @@
         <w:t>Example:</w:t>
       </w:r>
       <w:r>
-        <w:t xml:space="preserve"> "</w:t>
-      </w:r>
-      <w:proofErr w:type="spellStart"/>
-      <w:r>
-        <w:t>raw_content</w:t>
-      </w:r>
-      <w:proofErr w:type="spellEnd"/>
-      <w:r>
-        <w:t>" : "</w:t>
-      </w:r>
-      <w:proofErr w:type="spellStart"/>
-      <w:r>
-        <w:t>claude_response.message.text</w:t>
-      </w:r>
-      <w:proofErr w:type="spellEnd"/>
-      <w:r>
-        <w:t>"</w:t>
+        <w:t xml:space="preserve"> "raw_content" : "claude_response.message.text"</w:t>
       </w:r>
     </w:p>
     <w:p>
@@ -3613,15 +2520,7 @@
     </w:p>
     <w:p>
       <w:r>
-        <w:t xml:space="preserve">This is where </w:t>
-      </w:r>
-      <w:proofErr w:type="spellStart"/>
-      <w:r>
-        <w:t>BubbleFish</w:t>
-      </w:r>
-      <w:proofErr w:type="spellEnd"/>
-      <w:r>
-        <w:t xml:space="preserve"> becomes uniquely yours and incredibly fast.</w:t>
+        <w:t>This is where BubbleFish becomes uniquely yours and incredibly fast.</w:t>
       </w:r>
     </w:p>
     <w:p>
@@ -3636,15 +2535,7 @@
         <w:t>on the fly</w:t>
       </w:r>
       <w:r>
-        <w:t xml:space="preserve"> (at runtime), which slows them down. </w:t>
-      </w:r>
-      <w:proofErr w:type="spellStart"/>
-      <w:r>
-        <w:t>BubbleFish</w:t>
-      </w:r>
-      <w:proofErr w:type="spellEnd"/>
-      <w:r>
-        <w:t xml:space="preserve"> will evaluate them at </w:t>
+        <w:t xml:space="preserve"> (at runtime), which slows them down. BubbleFish will evaluate them at </w:t>
       </w:r>
       <w:r>
         <w:rPr>
@@ -3659,15 +2550,8 @@
     </w:p>
     <w:p>
       <w:r>
-        <w:t xml:space="preserve">When you run node build.js, </w:t>
-      </w:r>
-      <w:proofErr w:type="spellStart"/>
-      <w:r>
-        <w:t>BubbleFish</w:t>
-      </w:r>
-      <w:proofErr w:type="spellEnd"/>
-      <w:r>
-        <w:t>:</w:t>
+        <w:lastRenderedPageBreak/>
+        <w:t>When you run node build.js, BubbleFish:</w:t>
       </w:r>
     </w:p>
     <w:p>
@@ -3678,15 +2562,7 @@
         </w:numPr>
       </w:pPr>
       <w:r>
-        <w:t xml:space="preserve">Reads </w:t>
-      </w:r>
-      <w:proofErr w:type="spellStart"/>
-      <w:r>
-        <w:t>openbrain.json</w:t>
-      </w:r>
-      <w:proofErr w:type="spellEnd"/>
-      <w:r>
-        <w:t>.</w:t>
+        <w:t>Reads openbrain.json.</w:t>
       </w:r>
     </w:p>
     <w:p>
@@ -3723,15 +2599,7 @@
     </w:p>
     <w:p>
       <w:r>
-        <w:t xml:space="preserve">Because the translation logic is hardcoded into a brand new </w:t>
-      </w:r>
-      <w:proofErr w:type="spellStart"/>
-      <w:r>
-        <w:t>Javascript</w:t>
-      </w:r>
-      <w:proofErr w:type="spellEnd"/>
-      <w:r>
-        <w:t xml:space="preserve"> file during the build step, your runtime server doesn't have to "think" about how to translate the data when a request comes in. It just executes the pre-compiled file. This is how you achieve </w:t>
+        <w:t xml:space="preserve">Because the translation logic is hardcoded into a brand new Javascript file during the build step, your runtime server doesn't have to "think" about how to translate the data when a request comes in. It just executes the pre-compiled file. This is how you achieve </w:t>
       </w:r>
       <w:r>
         <w:rPr>
@@ -3761,15 +2629,7 @@
     </w:p>
     <w:p>
       <w:r>
-        <w:t xml:space="preserve">When you run node start.js, </w:t>
-      </w:r>
-      <w:proofErr w:type="spellStart"/>
-      <w:r>
-        <w:t>BubbleFish</w:t>
-      </w:r>
-      <w:proofErr w:type="spellEnd"/>
-      <w:r>
-        <w:t xml:space="preserve"> spins up the server using the .translated.js files.</w:t>
+        <w:t>When you run node start.js, BubbleFish spins up the server using the .translated.js files.</w:t>
       </w:r>
     </w:p>
     <w:p>
@@ -3783,120 +2643,119 @@
     </w:p>
     <w:p>
       <w:r>
+        <w:t>We build a strict Concurrency Queue into the core runtime. Even if Perplexity, Claude, and ChatGPT all send massive payloads at the exact same millisecond, BubbleFish catches them, puts them in an array, and processes them one by one. OpenBrain (Supabase) never gets overwhelmed, and no connections are dropped.</w:t>
+      </w:r>
+    </w:p>
+    <w:p>
+      <w:r>
+        <w:rPr>
+          <w:b/>
+          <w:bCs/>
+        </w:rPr>
+        <w:t>The Terminal UI:</w:t>
+      </w:r>
+    </w:p>
+    <w:p>
+      <w:r>
+        <w:t xml:space="preserve">To get that "Frontier CLI" look, we bypass standard console logs and build a static terminal dashboard using a library like </w:t>
+      </w:r>
+      <w:r>
+        <w:rPr>
+          <w:b/>
+          <w:bCs/>
+        </w:rPr>
+        <w:t>Ink</w:t>
+      </w:r>
+      <w:r>
+        <w:t xml:space="preserve"> or </w:t>
+      </w:r>
+      <w:r>
+        <w:rPr>
+          <w:b/>
+          <w:bCs/>
+        </w:rPr>
+        <w:t>Boxen</w:t>
+      </w:r>
+      <w:r>
+        <w:t xml:space="preserve"> (which let you draw boxes and layouts in the terminal).</w:t>
+      </w:r>
+    </w:p>
+    <w:p>
+      <w:r>
+        <w:t>Your terminal could look like this:</w:t>
+      </w:r>
+    </w:p>
+    <w:p>
+      <w:r>
+        <w:t>Plaintext</w:t>
+      </w:r>
+    </w:p>
+    <w:p>
+      <w:r>
+        <w:t>====================================================================</w:t>
+      </w:r>
+    </w:p>
+    <w:p>
+      <w:r>
+        <w:t xml:space="preserve"> </w:t>
+      </w:r>
+      <w:r>
+        <w:rPr>
+          <w:rFonts w:ascii="Segoe UI Emoji" w:hAnsi="Segoe UI Emoji" w:cs="Segoe UI Emoji"/>
+        </w:rPr>
+        <w:t>🐟</w:t>
+      </w:r>
+      <w:r>
+        <w:t xml:space="preserve"> BUBBLEFISH CORE v1.0.0                      DESTINATION: OpenBrain</w:t>
+      </w:r>
+    </w:p>
+    <w:p>
+      <w:r>
+        <w:t>====================================================================</w:t>
+      </w:r>
+    </w:p>
+    <w:p>
+      <w:r>
+        <w:t xml:space="preserve"> [ QUEUE STATUS ]  Waiting: 2  |  Processing: 1  |  Completed: 145</w:t>
+      </w:r>
+    </w:p>
+    <w:p>
+      <w:r>
+        <w:t>--------------------------------------------------------------------</w:t>
+      </w:r>
+    </w:p>
+    <w:p>
+      <w:r>
+        <w:t xml:space="preserve"> [ LIVE TRAFFIC ]</w:t>
+      </w:r>
+    </w:p>
+    <w:p>
+      <w:r>
+        <w:t xml:space="preserve"> </w:t>
+      </w:r>
+      <w:r>
+        <w:rPr>
+          <w:rFonts w:ascii="Segoe UI Emoji" w:hAnsi="Segoe UI Emoji" w:cs="Segoe UI Emoji"/>
+        </w:rPr>
+        <w:t>🟢</w:t>
+      </w:r>
+      <w:r>
+        <w:t xml:space="preserve"> [14:02:01] CLAUDE       -&gt; TRANSLATED -&gt; OpenBrain (24ms)</w:t>
+      </w:r>
+    </w:p>
+    <w:p>
+      <w:r>
         <w:lastRenderedPageBreak/>
-        <w:t xml:space="preserve">We build a strict Concurrency Queue into the core runtime. Even if Perplexity, Claude, and ChatGPT all send massive payloads at the exact same millisecond, </w:t>
-      </w:r>
-      <w:proofErr w:type="spellStart"/>
-      <w:r>
-        <w:t>BubbleFish</w:t>
-      </w:r>
-      <w:proofErr w:type="spellEnd"/>
-      <w:r>
-        <w:t xml:space="preserve"> catches them, puts them in an array, and processes them one by one. </w:t>
-      </w:r>
-      <w:proofErr w:type="spellStart"/>
-      <w:r>
-        <w:t>OpenBrain</w:t>
-      </w:r>
-      <w:proofErr w:type="spellEnd"/>
-      <w:r>
-        <w:t xml:space="preserve"> (</w:t>
-      </w:r>
-      <w:proofErr w:type="spellStart"/>
-      <w:r>
-        <w:t>Supabase</w:t>
-      </w:r>
-      <w:proofErr w:type="spellEnd"/>
-      <w:r>
-        <w:t>) never gets overwhelmed, and no connections are dropped.</w:t>
-      </w:r>
-    </w:p>
-    <w:p>
-      <w:r>
-        <w:rPr>
-          <w:b/>
-          <w:bCs/>
-        </w:rPr>
-        <w:t>The Terminal UI:</w:t>
-      </w:r>
-    </w:p>
-    <w:p>
-      <w:r>
-        <w:t xml:space="preserve">To get that "Frontier CLI" look, we bypass standard console logs and build a static terminal dashboard using a library like </w:t>
-      </w:r>
-      <w:r>
-        <w:rPr>
-          <w:b/>
-          <w:bCs/>
-        </w:rPr>
-        <w:t>Ink</w:t>
-      </w:r>
-      <w:r>
-        <w:t xml:space="preserve"> or </w:t>
-      </w:r>
-      <w:r>
-        <w:rPr>
-          <w:b/>
-          <w:bCs/>
-        </w:rPr>
-        <w:t>Boxen</w:t>
-      </w:r>
-      <w:r>
-        <w:t xml:space="preserve"> (which let you draw boxes and layouts in the terminal).</w:t>
-      </w:r>
-    </w:p>
-    <w:p>
-      <w:r>
-        <w:t>Your terminal could look like this:</w:t>
-      </w:r>
-    </w:p>
-    <w:p>
-      <w:r>
-        <w:t>Plaintext</w:t>
-      </w:r>
-    </w:p>
-    <w:p>
-      <w:r>
-        <w:t>====================================================================</w:t>
-      </w:r>
-    </w:p>
-    <w:p>
-      <w:r>
         <w:t xml:space="preserve"> </w:t>
       </w:r>
       <w:r>
         <w:rPr>
           <w:rFonts w:ascii="Segoe UI Emoji" w:hAnsi="Segoe UI Emoji" w:cs="Segoe UI Emoji"/>
         </w:rPr>
-        <w:t>🐟</w:t>
-      </w:r>
-      <w:r>
-        <w:t xml:space="preserve"> BUBBLEFISH CORE v1.0.0                      DESTINATION: </w:t>
-      </w:r>
-      <w:proofErr w:type="spellStart"/>
-      <w:r>
-        <w:t>OpenBrain</w:t>
-      </w:r>
-      <w:proofErr w:type="spellEnd"/>
-    </w:p>
-    <w:p>
-      <w:r>
-        <w:t>====================================================================</w:t>
-      </w:r>
-    </w:p>
-    <w:p>
-      <w:r>
-        <w:t xml:space="preserve"> [ QUEUE STATUS ]  Waiting: 2  |  Processing: 1  |  Completed: 145</w:t>
-      </w:r>
-    </w:p>
-    <w:p>
-      <w:r>
-        <w:t>--------------------------------------------------------------------</w:t>
-      </w:r>
-    </w:p>
-    <w:p>
-      <w:r>
-        <w:t xml:space="preserve"> [ LIVE TRAFFIC ]</w:t>
+        <w:t>🟡</w:t>
+      </w:r>
+      <w:r>
+        <w:t xml:space="preserve"> [14:02:02] PERPLEXITY   -&gt; TRANSLATING...</w:t>
       </w:r>
     </w:p>
     <w:p>
@@ -3907,54 +2766,10 @@
         <w:rPr>
           <w:rFonts w:ascii="Segoe UI Emoji" w:hAnsi="Segoe UI Emoji" w:cs="Segoe UI Emoji"/>
         </w:rPr>
-        <w:t>🟢</w:t>
-      </w:r>
-      <w:r>
-        <w:t xml:space="preserve"> [14:02:01] CLAUDE       -&gt; TRANSLATED -&gt; </w:t>
-      </w:r>
-      <w:proofErr w:type="spellStart"/>
-      <w:r>
-        <w:t>OpenBrain</w:t>
-      </w:r>
-      <w:proofErr w:type="spellEnd"/>
-      <w:r>
-        <w:t xml:space="preserve"> (24ms)</w:t>
-      </w:r>
-    </w:p>
-    <w:p>
-      <w:r>
-        <w:t xml:space="preserve"> </w:t>
-      </w:r>
-      <w:r>
-        <w:rPr>
-          <w:rFonts w:ascii="Segoe UI Emoji" w:hAnsi="Segoe UI Emoji" w:cs="Segoe UI Emoji"/>
-        </w:rPr>
-        <w:t>🟡</w:t>
-      </w:r>
-      <w:r>
-        <w:t xml:space="preserve"> [14:02:02] PERPLEXITY   -&gt; TRANSLATING...</w:t>
-      </w:r>
-    </w:p>
-    <w:p>
-      <w:r>
-        <w:t xml:space="preserve"> </w:t>
-      </w:r>
-      <w:r>
-        <w:rPr>
-          <w:rFonts w:ascii="Segoe UI Emoji" w:hAnsi="Segoe UI Emoji" w:cs="Segoe UI Emoji"/>
-        </w:rPr>
         <w:t>🔴</w:t>
       </w:r>
       <w:r>
-        <w:t xml:space="preserve"> [14:00:14] CHATGPT      -&gt; ERROR: Missing "</w:t>
-      </w:r>
-      <w:proofErr w:type="spellStart"/>
-      <w:r>
-        <w:t>raw_content</w:t>
-      </w:r>
-      <w:proofErr w:type="spellEnd"/>
-      <w:r>
-        <w:t>" key</w:t>
+        <w:t xml:space="preserve"> [14:00:14] CHATGPT      -&gt; ERROR: Missing "raw_content" key</w:t>
       </w:r>
     </w:p>
     <w:p>
@@ -4043,20 +2858,17 @@
     </w:p>
     <w:p>
       <w:r>
-        <w:lastRenderedPageBreak/>
-        <w:t xml:space="preserve">Would you like to draft the exact JSON structure for the </w:t>
-      </w:r>
-      <w:proofErr w:type="spellStart"/>
-      <w:r>
-        <w:t>openbrain.json</w:t>
-      </w:r>
-      <w:proofErr w:type="spellEnd"/>
-      <w:r>
-        <w:t xml:space="preserve"> destination file so we can see how the sources will map to it?</w:t>
+        <w:t>Would you like to draft the exact JSON structure for the openbrain.json destination file so we can see how the sources will map to it?</w:t>
       </w:r>
     </w:p>
     <w:p/>
     <w:sectPr>
+      <w:headerReference w:type="even" r:id="rId10"/>
+      <w:headerReference w:type="default" r:id="rId11"/>
+      <w:footerReference w:type="even" r:id="rId12"/>
+      <w:footerReference w:type="default" r:id="rId13"/>
+      <w:headerReference w:type="first" r:id="rId14"/>
+      <w:footerReference w:type="first" r:id="rId15"/>
       <w:pgSz w:w="12240" w:h="15840"/>
       <w:pgMar w:top="1440" w:right="1440" w:bottom="1440" w:left="1440" w:header="720" w:footer="720" w:gutter="0"/>
       <w:cols w:space="720"/>
@@ -4064,6 +2876,119 @@
     </w:sectPr>
   </w:body>
 </w:document>
+</file>
+
+<file path=word/endnotes.xml><?xml version="1.0" encoding="utf-8"?>
+<w:endnotes xmlns:wpc="http://schemas.microsoft.com/office/word/2010/wordprocessingCanvas" xmlns:cx="http://schemas.microsoft.com/office/drawing/2014/chartex" xmlns:cx1="http://schemas.microsoft.com/office/drawing/2015/9/8/chartex" xmlns:cx2="http://schemas.microsoft.com/office/drawing/2015/10/21/chartex" xmlns:cx3="http://schemas.microsoft.com/office/drawing/2016/5/9/chartex" xmlns:cx4="http://schemas.microsoft.com/office/drawing/2016/5/10/chartex" xmlns:cx5="http://schemas.microsoft.com/office/drawing/2016/5/11/chartex" xmlns:cx6="http://schemas.microsoft.com/office/drawing/2016/5/12/chartex" xmlns:cx7="http://schemas.microsoft.com/office/drawing/2016/5/13/chartex" xmlns:cx8="http://schemas.microsoft.com/office/drawing/2016/5/14/chartex" xmlns:mc="http://schemas.openxmlformats.org/markup-compatibility/2006" xmlns:aink="http://schemas.microsoft.com/office/drawing/2016/ink" xmlns:am3d="http://schemas.microsoft.com/office/drawing/2017/model3d" xmlns:o="urn:schemas-microsoft-com:office:office" xmlns:oel="http://schemas.microsoft.com/office/2019/extlst" xmlns:r="http://schemas.openxmlformats.org/officeDocument/2006/relationships" xmlns:m="http://schemas.openxmlformats.org/officeDocument/2006/math" xmlns:v="urn:schemas-microsoft-com:vml" xmlns:wp14="http://schemas.microsoft.com/office/word/2010/wordprocessingDrawing" xmlns:wp="http://schemas.openxmlformats.org/drawingml/2006/wordprocessingDrawing" xmlns:w10="urn:schemas-microsoft-com:office:word" xmlns:w="http://schemas.openxmlformats.org/wordprocessingml/2006/main" xmlns:w14="http://schemas.microsoft.com/office/word/2010/wordml" xmlns:w15="http://schemas.microsoft.com/office/word/2012/wordml" xmlns:w16cex="http://schemas.microsoft.com/office/word/2018/wordml/cex" xmlns:w16cid="http://schemas.microsoft.com/office/word/2016/wordml/cid" xmlns:w16="http://schemas.microsoft.com/office/word/2018/wordml" xmlns:w16du="http://schemas.microsoft.com/office/word/2023/wordml/word16du" xmlns:w16sdtdh="http://schemas.microsoft.com/office/word/2020/wordml/sdtdatahash" xmlns:w16sdtfl="http://schemas.microsoft.com/office/word/2024/wordml/sdtformatlock" xmlns:w16se="http://schemas.microsoft.com/office/word/2015/wordml/symex" xmlns:wpg="http://schemas.microsoft.com/office/word/2010/wordprocessingGroup" xmlns:wpi="http://schemas.microsoft.com/office/word/2010/wordprocessingInk" xmlns:wne="http://schemas.microsoft.com/office/word/2006/wordml" xmlns:wps="http://schemas.microsoft.com/office/word/2010/wordprocessingShape" mc:Ignorable="w14 w15 w16se w16cid w16 w16cex w16sdtdh w16sdtfl w16du wp14">
+  <w:endnote w:type="separator" w:id="-1">
+    <w:p>
+      <w:pPr>
+        <w:spacing w:after="0" w:line="240" w:lineRule="auto"/>
+      </w:pPr>
+      <w:r>
+        <w:separator/>
+      </w:r>
+    </w:p>
+  </w:endnote>
+  <w:endnote w:type="continuationSeparator" w:id="0">
+    <w:p>
+      <w:pPr>
+        <w:spacing w:after="0" w:line="240" w:lineRule="auto"/>
+      </w:pPr>
+      <w:r>
+        <w:continuationSeparator/>
+      </w:r>
+    </w:p>
+  </w:endnote>
+</w:endnotes>
+</file>
+
+<file path=word/footer1.xml><?xml version="1.0" encoding="utf-8"?>
+<w:ftr xmlns:wpc="http://schemas.microsoft.com/office/word/2010/wordprocessingCanvas" xmlns:cx="http://schemas.microsoft.com/office/drawing/2014/chartex" xmlns:cx1="http://schemas.microsoft.com/office/drawing/2015/9/8/chartex" xmlns:cx2="http://schemas.microsoft.com/office/drawing/2015/10/21/chartex" xmlns:cx3="http://schemas.microsoft.com/office/drawing/2016/5/9/chartex" xmlns:cx4="http://schemas.microsoft.com/office/drawing/2016/5/10/chartex" xmlns:cx5="http://schemas.microsoft.com/office/drawing/2016/5/11/chartex" xmlns:cx6="http://schemas.microsoft.com/office/drawing/2016/5/12/chartex" xmlns:cx7="http://schemas.microsoft.com/office/drawing/2016/5/13/chartex" xmlns:cx8="http://schemas.microsoft.com/office/drawing/2016/5/14/chartex" xmlns:mc="http://schemas.openxmlformats.org/markup-compatibility/2006" xmlns:aink="http://schemas.microsoft.com/office/drawing/2016/ink" xmlns:am3d="http://schemas.microsoft.com/office/drawing/2017/model3d" xmlns:o="urn:schemas-microsoft-com:office:office" xmlns:oel="http://schemas.microsoft.com/office/2019/extlst" xmlns:r="http://schemas.openxmlformats.org/officeDocument/2006/relationships" xmlns:m="http://schemas.openxmlformats.org/officeDocument/2006/math" xmlns:v="urn:schemas-microsoft-com:vml" xmlns:wp14="http://schemas.microsoft.com/office/word/2010/wordprocessingDrawing" xmlns:wp="http://schemas.openxmlformats.org/drawingml/2006/wordprocessingDrawing" xmlns:w10="urn:schemas-microsoft-com:office:word" xmlns:w="http://schemas.openxmlformats.org/wordprocessingml/2006/main" xmlns:w14="http://schemas.microsoft.com/office/word/2010/wordml" xmlns:w15="http://schemas.microsoft.com/office/word/2012/wordml" xmlns:w16cex="http://schemas.microsoft.com/office/word/2018/wordml/cex" xmlns:w16cid="http://schemas.microsoft.com/office/word/2016/wordml/cid" xmlns:w16="http://schemas.microsoft.com/office/word/2018/wordml" xmlns:w16du="http://schemas.microsoft.com/office/word/2023/wordml/word16du" xmlns:w16sdtdh="http://schemas.microsoft.com/office/word/2020/wordml/sdtdatahash" xmlns:w16sdtfl="http://schemas.microsoft.com/office/word/2024/wordml/sdtformatlock" xmlns:w16se="http://schemas.microsoft.com/office/word/2015/wordml/symex" xmlns:wpg="http://schemas.microsoft.com/office/word/2010/wordprocessingGroup" xmlns:wpi="http://schemas.microsoft.com/office/word/2010/wordprocessingInk" xmlns:wne="http://schemas.microsoft.com/office/word/2006/wordml" xmlns:wps="http://schemas.microsoft.com/office/word/2010/wordprocessingShape" mc:Ignorable="w14 w15 w16se w16cid w16 w16cex w16sdtdh w16sdtfl w16du wp14">
+  <w:p>
+    <w:pPr>
+      <w:pStyle w:val="Footer"/>
+    </w:pPr>
+  </w:p>
+</w:ftr>
+</file>
+
+<file path=word/footer2.xml><?xml version="1.0" encoding="utf-8"?>
+<w:ftr xmlns:wpc="http://schemas.microsoft.com/office/word/2010/wordprocessingCanvas" xmlns:cx="http://schemas.microsoft.com/office/drawing/2014/chartex" xmlns:cx1="http://schemas.microsoft.com/office/drawing/2015/9/8/chartex" xmlns:cx2="http://schemas.microsoft.com/office/drawing/2015/10/21/chartex" xmlns:cx3="http://schemas.microsoft.com/office/drawing/2016/5/9/chartex" xmlns:cx4="http://schemas.microsoft.com/office/drawing/2016/5/10/chartex" xmlns:cx5="http://schemas.microsoft.com/office/drawing/2016/5/11/chartex" xmlns:cx6="http://schemas.microsoft.com/office/drawing/2016/5/12/chartex" xmlns:cx7="http://schemas.microsoft.com/office/drawing/2016/5/13/chartex" xmlns:cx8="http://schemas.microsoft.com/office/drawing/2016/5/14/chartex" xmlns:mc="http://schemas.openxmlformats.org/markup-compatibility/2006" xmlns:aink="http://schemas.microsoft.com/office/drawing/2016/ink" xmlns:am3d="http://schemas.microsoft.com/office/drawing/2017/model3d" xmlns:o="urn:schemas-microsoft-com:office:office" xmlns:oel="http://schemas.microsoft.com/office/2019/extlst" xmlns:r="http://schemas.openxmlformats.org/officeDocument/2006/relationships" xmlns:m="http://schemas.openxmlformats.org/officeDocument/2006/math" xmlns:v="urn:schemas-microsoft-com:vml" xmlns:wp14="http://schemas.microsoft.com/office/word/2010/wordprocessingDrawing" xmlns:wp="http://schemas.openxmlformats.org/drawingml/2006/wordprocessingDrawing" xmlns:w10="urn:schemas-microsoft-com:office:word" xmlns:w="http://schemas.openxmlformats.org/wordprocessingml/2006/main" xmlns:w14="http://schemas.microsoft.com/office/word/2010/wordml" xmlns:w15="http://schemas.microsoft.com/office/word/2012/wordml" xmlns:w16cex="http://schemas.microsoft.com/office/word/2018/wordml/cex" xmlns:w16cid="http://schemas.microsoft.com/office/word/2016/wordml/cid" xmlns:w16="http://schemas.microsoft.com/office/word/2018/wordml" xmlns:w16du="http://schemas.microsoft.com/office/word/2023/wordml/word16du" xmlns:w16sdtdh="http://schemas.microsoft.com/office/word/2020/wordml/sdtdatahash" xmlns:w16sdtfl="http://schemas.microsoft.com/office/word/2024/wordml/sdtformatlock" xmlns:w16se="http://schemas.microsoft.com/office/word/2015/wordml/symex" xmlns:wpg="http://schemas.microsoft.com/office/word/2010/wordprocessingGroup" xmlns:wpi="http://schemas.microsoft.com/office/word/2010/wordprocessingInk" xmlns:wne="http://schemas.microsoft.com/office/word/2006/wordml" xmlns:wps="http://schemas.microsoft.com/office/word/2010/wordprocessingShape" mc:Ignorable="w14 w15 w16se w16cid w16 w16cex w16sdtdh w16sdtfl w16du wp14">
+  <w:p>
+    <w:pPr>
+      <w:pStyle w:val="Footer"/>
+    </w:pPr>
+  </w:p>
+</w:ftr>
+</file>
+
+<file path=word/footer3.xml><?xml version="1.0" encoding="utf-8"?>
+<w:ftr xmlns:wpc="http://schemas.microsoft.com/office/word/2010/wordprocessingCanvas" xmlns:cx="http://schemas.microsoft.com/office/drawing/2014/chartex" xmlns:cx1="http://schemas.microsoft.com/office/drawing/2015/9/8/chartex" xmlns:cx2="http://schemas.microsoft.com/office/drawing/2015/10/21/chartex" xmlns:cx3="http://schemas.microsoft.com/office/drawing/2016/5/9/chartex" xmlns:cx4="http://schemas.microsoft.com/office/drawing/2016/5/10/chartex" xmlns:cx5="http://schemas.microsoft.com/office/drawing/2016/5/11/chartex" xmlns:cx6="http://schemas.microsoft.com/office/drawing/2016/5/12/chartex" xmlns:cx7="http://schemas.microsoft.com/office/drawing/2016/5/13/chartex" xmlns:cx8="http://schemas.microsoft.com/office/drawing/2016/5/14/chartex" xmlns:mc="http://schemas.openxmlformats.org/markup-compatibility/2006" xmlns:aink="http://schemas.microsoft.com/office/drawing/2016/ink" xmlns:am3d="http://schemas.microsoft.com/office/drawing/2017/model3d" xmlns:o="urn:schemas-microsoft-com:office:office" xmlns:oel="http://schemas.microsoft.com/office/2019/extlst" xmlns:r="http://schemas.openxmlformats.org/officeDocument/2006/relationships" xmlns:m="http://schemas.openxmlformats.org/officeDocument/2006/math" xmlns:v="urn:schemas-microsoft-com:vml" xmlns:wp14="http://schemas.microsoft.com/office/word/2010/wordprocessingDrawing" xmlns:wp="http://schemas.openxmlformats.org/drawingml/2006/wordprocessingDrawing" xmlns:w10="urn:schemas-microsoft-com:office:word" xmlns:w="http://schemas.openxmlformats.org/wordprocessingml/2006/main" xmlns:w14="http://schemas.microsoft.com/office/word/2010/wordml" xmlns:w15="http://schemas.microsoft.com/office/word/2012/wordml" xmlns:w16cex="http://schemas.microsoft.com/office/word/2018/wordml/cex" xmlns:w16cid="http://schemas.microsoft.com/office/word/2016/wordml/cid" xmlns:w16="http://schemas.microsoft.com/office/word/2018/wordml" xmlns:w16du="http://schemas.microsoft.com/office/word/2023/wordml/word16du" xmlns:w16sdtdh="http://schemas.microsoft.com/office/word/2020/wordml/sdtdatahash" xmlns:w16sdtfl="http://schemas.microsoft.com/office/word/2024/wordml/sdtformatlock" xmlns:w16se="http://schemas.microsoft.com/office/word/2015/wordml/symex" xmlns:wpg="http://schemas.microsoft.com/office/word/2010/wordprocessingGroup" xmlns:wpi="http://schemas.microsoft.com/office/word/2010/wordprocessingInk" xmlns:wne="http://schemas.microsoft.com/office/word/2006/wordml" xmlns:wps="http://schemas.microsoft.com/office/word/2010/wordprocessingShape" mc:Ignorable="w14 w15 w16se w16cid w16 w16cex w16sdtdh w16sdtfl w16du wp14">
+  <w:p>
+    <w:pPr>
+      <w:pStyle w:val="Footer"/>
+    </w:pPr>
+  </w:p>
+</w:ftr>
+</file>
+
+<file path=word/footnotes.xml><?xml version="1.0" encoding="utf-8"?>
+<w:footnotes xmlns:wpc="http://schemas.microsoft.com/office/word/2010/wordprocessingCanvas" xmlns:cx="http://schemas.microsoft.com/office/drawing/2014/chartex" xmlns:cx1="http://schemas.microsoft.com/office/drawing/2015/9/8/chartex" xmlns:cx2="http://schemas.microsoft.com/office/drawing/2015/10/21/chartex" xmlns:cx3="http://schemas.microsoft.com/office/drawing/2016/5/9/chartex" xmlns:cx4="http://schemas.microsoft.com/office/drawing/2016/5/10/chartex" xmlns:cx5="http://schemas.microsoft.com/office/drawing/2016/5/11/chartex" xmlns:cx6="http://schemas.microsoft.com/office/drawing/2016/5/12/chartex" xmlns:cx7="http://schemas.microsoft.com/office/drawing/2016/5/13/chartex" xmlns:cx8="http://schemas.microsoft.com/office/drawing/2016/5/14/chartex" xmlns:mc="http://schemas.openxmlformats.org/markup-compatibility/2006" xmlns:aink="http://schemas.microsoft.com/office/drawing/2016/ink" xmlns:am3d="http://schemas.microsoft.com/office/drawing/2017/model3d" xmlns:o="urn:schemas-microsoft-com:office:office" xmlns:oel="http://schemas.microsoft.com/office/2019/extlst" xmlns:r="http://schemas.openxmlformats.org/officeDocument/2006/relationships" xmlns:m="http://schemas.openxmlformats.org/officeDocument/2006/math" xmlns:v="urn:schemas-microsoft-com:vml" xmlns:wp14="http://schemas.microsoft.com/office/word/2010/wordprocessingDrawing" xmlns:wp="http://schemas.openxmlformats.org/drawingml/2006/wordprocessingDrawing" xmlns:w10="urn:schemas-microsoft-com:office:word" xmlns:w="http://schemas.openxmlformats.org/wordprocessingml/2006/main" xmlns:w14="http://schemas.microsoft.com/office/word/2010/wordml" xmlns:w15="http://schemas.microsoft.com/office/word/2012/wordml" xmlns:w16cex="http://schemas.microsoft.com/office/word/2018/wordml/cex" xmlns:w16cid="http://schemas.microsoft.com/office/word/2016/wordml/cid" xmlns:w16="http://schemas.microsoft.com/office/word/2018/wordml" xmlns:w16du="http://schemas.microsoft.com/office/word/2023/wordml/word16du" xmlns:w16sdtdh="http://schemas.microsoft.com/office/word/2020/wordml/sdtdatahash" xmlns:w16sdtfl="http://schemas.microsoft.com/office/word/2024/wordml/sdtformatlock" xmlns:w16se="http://schemas.microsoft.com/office/word/2015/wordml/symex" xmlns:wpg="http://schemas.microsoft.com/office/word/2010/wordprocessingGroup" xmlns:wpi="http://schemas.microsoft.com/office/word/2010/wordprocessingInk" xmlns:wne="http://schemas.microsoft.com/office/word/2006/wordml" xmlns:wps="http://schemas.microsoft.com/office/word/2010/wordprocessingShape" mc:Ignorable="w14 w15 w16se w16cid w16 w16cex w16sdtdh w16sdtfl w16du wp14">
+  <w:footnote w:type="separator" w:id="-1">
+    <w:p>
+      <w:pPr>
+        <w:spacing w:after="0" w:line="240" w:lineRule="auto"/>
+      </w:pPr>
+      <w:r>
+        <w:separator/>
+      </w:r>
+    </w:p>
+  </w:footnote>
+  <w:footnote w:type="continuationSeparator" w:id="0">
+    <w:p>
+      <w:pPr>
+        <w:spacing w:after="0" w:line="240" w:lineRule="auto"/>
+      </w:pPr>
+      <w:r>
+        <w:continuationSeparator/>
+      </w:r>
+    </w:p>
+  </w:footnote>
+</w:footnotes>
+</file>
+
+<file path=word/header1.xml><?xml version="1.0" encoding="utf-8"?>
+<w:hdr xmlns:wpc="http://schemas.microsoft.com/office/word/2010/wordprocessingCanvas" xmlns:cx="http://schemas.microsoft.com/office/drawing/2014/chartex" xmlns:cx1="http://schemas.microsoft.com/office/drawing/2015/9/8/chartex" xmlns:cx2="http://schemas.microsoft.com/office/drawing/2015/10/21/chartex" xmlns:cx3="http://schemas.microsoft.com/office/drawing/2016/5/9/chartex" xmlns:cx4="http://schemas.microsoft.com/office/drawing/2016/5/10/chartex" xmlns:cx5="http://schemas.microsoft.com/office/drawing/2016/5/11/chartex" xmlns:cx6="http://schemas.microsoft.com/office/drawing/2016/5/12/chartex" xmlns:cx7="http://schemas.microsoft.com/office/drawing/2016/5/13/chartex" xmlns:cx8="http://schemas.microsoft.com/office/drawing/2016/5/14/chartex" xmlns:mc="http://schemas.openxmlformats.org/markup-compatibility/2006" xmlns:aink="http://schemas.microsoft.com/office/drawing/2016/ink" xmlns:am3d="http://schemas.microsoft.com/office/drawing/2017/model3d" xmlns:o="urn:schemas-microsoft-com:office:office" xmlns:oel="http://schemas.microsoft.com/office/2019/extlst" xmlns:r="http://schemas.openxmlformats.org/officeDocument/2006/relationships" xmlns:m="http://schemas.openxmlformats.org/officeDocument/2006/math" xmlns:v="urn:schemas-microsoft-com:vml" xmlns:wp14="http://schemas.microsoft.com/office/word/2010/wordprocessingDrawing" xmlns:wp="http://schemas.openxmlformats.org/drawingml/2006/wordprocessingDrawing" xmlns:w10="urn:schemas-microsoft-com:office:word" xmlns:w="http://schemas.openxmlformats.org/wordprocessingml/2006/main" xmlns:w14="http://schemas.microsoft.com/office/word/2010/wordml" xmlns:w15="http://schemas.microsoft.com/office/word/2012/wordml" xmlns:w16cex="http://schemas.microsoft.com/office/word/2018/wordml/cex" xmlns:w16cid="http://schemas.microsoft.com/office/word/2016/wordml/cid" xmlns:w16="http://schemas.microsoft.com/office/word/2018/wordml" xmlns:w16du="http://schemas.microsoft.com/office/word/2023/wordml/word16du" xmlns:w16sdtdh="http://schemas.microsoft.com/office/word/2020/wordml/sdtdatahash" xmlns:w16sdtfl="http://schemas.microsoft.com/office/word/2024/wordml/sdtformatlock" xmlns:w16se="http://schemas.microsoft.com/office/word/2015/wordml/symex" xmlns:wpg="http://schemas.microsoft.com/office/word/2010/wordprocessingGroup" xmlns:wpi="http://schemas.microsoft.com/office/word/2010/wordprocessingInk" xmlns:wne="http://schemas.microsoft.com/office/word/2006/wordml" xmlns:wps="http://schemas.microsoft.com/office/word/2010/wordprocessingShape" mc:Ignorable="w14 w15 w16se w16cid w16 w16cex w16sdtdh w16sdtfl w16du wp14">
+  <w:p>
+    <w:pPr>
+      <w:pStyle w:val="Header"/>
+    </w:pPr>
+  </w:p>
+</w:hdr>
+</file>
+
+<file path=word/header2.xml><?xml version="1.0" encoding="utf-8"?>
+<w:hdr xmlns:wpc="http://schemas.microsoft.com/office/word/2010/wordprocessingCanvas" xmlns:cx="http://schemas.microsoft.com/office/drawing/2014/chartex" xmlns:cx1="http://schemas.microsoft.com/office/drawing/2015/9/8/chartex" xmlns:cx2="http://schemas.microsoft.com/office/drawing/2015/10/21/chartex" xmlns:cx3="http://schemas.microsoft.com/office/drawing/2016/5/9/chartex" xmlns:cx4="http://schemas.microsoft.com/office/drawing/2016/5/10/chartex" xmlns:cx5="http://schemas.microsoft.com/office/drawing/2016/5/11/chartex" xmlns:cx6="http://schemas.microsoft.com/office/drawing/2016/5/12/chartex" xmlns:cx7="http://schemas.microsoft.com/office/drawing/2016/5/13/chartex" xmlns:cx8="http://schemas.microsoft.com/office/drawing/2016/5/14/chartex" xmlns:mc="http://schemas.openxmlformats.org/markup-compatibility/2006" xmlns:aink="http://schemas.microsoft.com/office/drawing/2016/ink" xmlns:am3d="http://schemas.microsoft.com/office/drawing/2017/model3d" xmlns:o="urn:schemas-microsoft-com:office:office" xmlns:oel="http://schemas.microsoft.com/office/2019/extlst" xmlns:r="http://schemas.openxmlformats.org/officeDocument/2006/relationships" xmlns:m="http://schemas.openxmlformats.org/officeDocument/2006/math" xmlns:v="urn:schemas-microsoft-com:vml" xmlns:wp14="http://schemas.microsoft.com/office/word/2010/wordprocessingDrawing" xmlns:wp="http://schemas.openxmlformats.org/drawingml/2006/wordprocessingDrawing" xmlns:w10="urn:schemas-microsoft-com:office:word" xmlns:w="http://schemas.openxmlformats.org/wordprocessingml/2006/main" xmlns:w14="http://schemas.microsoft.com/office/word/2010/wordml" xmlns:w15="http://schemas.microsoft.com/office/word/2012/wordml" xmlns:w16cex="http://schemas.microsoft.com/office/word/2018/wordml/cex" xmlns:w16cid="http://schemas.microsoft.com/office/word/2016/wordml/cid" xmlns:w16="http://schemas.microsoft.com/office/word/2018/wordml" xmlns:w16du="http://schemas.microsoft.com/office/word/2023/wordml/word16du" xmlns:w16sdtdh="http://schemas.microsoft.com/office/word/2020/wordml/sdtdatahash" xmlns:w16sdtfl="http://schemas.microsoft.com/office/word/2024/wordml/sdtformatlock" xmlns:w16se="http://schemas.microsoft.com/office/word/2015/wordml/symex" xmlns:wpg="http://schemas.microsoft.com/office/word/2010/wordprocessingGroup" xmlns:wpi="http://schemas.microsoft.com/office/word/2010/wordprocessingInk" xmlns:wne="http://schemas.microsoft.com/office/word/2006/wordml" xmlns:wps="http://schemas.microsoft.com/office/word/2010/wordprocessingShape" mc:Ignorable="w14 w15 w16se w16cid w16 w16cex w16sdtdh w16sdtfl w16du wp14">
+  <w:p>
+    <w:pPr>
+      <w:pStyle w:val="Header"/>
+    </w:pPr>
+    <w:r>
+      <w:t>© 2026 Shawn Sammartano. All rights reserved.</w:t>
+    </w:r>
+  </w:p>
+</w:hdr>
+</file>
+
+<file path=word/header3.xml><?xml version="1.0" encoding="utf-8"?>
+<w:hdr xmlns:wpc="http://schemas.microsoft.com/office/word/2010/wordprocessingCanvas" xmlns:cx="http://schemas.microsoft.com/office/drawing/2014/chartex" xmlns:cx1="http://schemas.microsoft.com/office/drawing/2015/9/8/chartex" xmlns:cx2="http://schemas.microsoft.com/office/drawing/2015/10/21/chartex" xmlns:cx3="http://schemas.microsoft.com/office/drawing/2016/5/9/chartex" xmlns:cx4="http://schemas.microsoft.com/office/drawing/2016/5/10/chartex" xmlns:cx5="http://schemas.microsoft.com/office/drawing/2016/5/11/chartex" xmlns:cx6="http://schemas.microsoft.com/office/drawing/2016/5/12/chartex" xmlns:cx7="http://schemas.microsoft.com/office/drawing/2016/5/13/chartex" xmlns:cx8="http://schemas.microsoft.com/office/drawing/2016/5/14/chartex" xmlns:mc="http://schemas.openxmlformats.org/markup-compatibility/2006" xmlns:aink="http://schemas.microsoft.com/office/drawing/2016/ink" xmlns:am3d="http://schemas.microsoft.com/office/drawing/2017/model3d" xmlns:o="urn:schemas-microsoft-com:office:office" xmlns:oel="http://schemas.microsoft.com/office/2019/extlst" xmlns:r="http://schemas.openxmlformats.org/officeDocument/2006/relationships" xmlns:m="http://schemas.openxmlformats.org/officeDocument/2006/math" xmlns:v="urn:schemas-microsoft-com:vml" xmlns:wp14="http://schemas.microsoft.com/office/word/2010/wordprocessingDrawing" xmlns:wp="http://schemas.openxmlformats.org/drawingml/2006/wordprocessingDrawing" xmlns:w10="urn:schemas-microsoft-com:office:word" xmlns:w="http://schemas.openxmlformats.org/wordprocessingml/2006/main" xmlns:w14="http://schemas.microsoft.com/office/word/2010/wordml" xmlns:w15="http://schemas.microsoft.com/office/word/2012/wordml" xmlns:w16cex="http://schemas.microsoft.com/office/word/2018/wordml/cex" xmlns:w16cid="http://schemas.microsoft.com/office/word/2016/wordml/cid" xmlns:w16="http://schemas.microsoft.com/office/word/2018/wordml" xmlns:w16du="http://schemas.microsoft.com/office/word/2023/wordml/word16du" xmlns:w16sdtdh="http://schemas.microsoft.com/office/word/2020/wordml/sdtdatahash" xmlns:w16sdtfl="http://schemas.microsoft.com/office/word/2024/wordml/sdtformatlock" xmlns:w16se="http://schemas.microsoft.com/office/word/2015/wordml/symex" xmlns:wpg="http://schemas.microsoft.com/office/word/2010/wordprocessingGroup" xmlns:wpi="http://schemas.microsoft.com/office/word/2010/wordprocessingInk" xmlns:wne="http://schemas.microsoft.com/office/word/2006/wordml" xmlns:wps="http://schemas.microsoft.com/office/word/2010/wordprocessingShape" mc:Ignorable="w14 w15 w16se w16cid w16 w16cex w16sdtdh w16sdtfl w16du wp14">
+  <w:p>
+    <w:pPr>
+      <w:pStyle w:val="Header"/>
+    </w:pPr>
+  </w:p>
+</w:hdr>
 </file>
 
 <file path=word/numbering.xml><?xml version="1.0" encoding="utf-8"?>
@@ -7758,6 +6683,7 @@
   <w:style w:type="character" w:default="1" w:styleId="DefaultParagraphFont">
     <w:name w:val="Default Paragraph Font"/>
     <w:uiPriority w:val="1"/>
+    <w:semiHidden/>
     <w:unhideWhenUsed/>
   </w:style>
   <w:style w:type="table" w:default="1" w:styleId="TableNormal">
@@ -8105,6 +7031,50 @@
       <w:shd w:val="clear" w:color="auto" w:fill="E1DFDD"/>
     </w:rPr>
   </w:style>
+  <w:style w:type="paragraph" w:styleId="Header">
+    <w:name w:val="header"/>
+    <w:basedOn w:val="Normal"/>
+    <w:link w:val="HeaderChar"/>
+    <w:uiPriority w:val="99"/>
+    <w:unhideWhenUsed/>
+    <w:rsid w:val="00091F25"/>
+    <w:pPr>
+      <w:tabs>
+        <w:tab w:val="center" w:pos="4680"/>
+        <w:tab w:val="right" w:pos="9360"/>
+      </w:tabs>
+      <w:spacing w:after="0" w:line="240" w:lineRule="auto"/>
+    </w:pPr>
+  </w:style>
+  <w:style w:type="character" w:customStyle="1" w:styleId="HeaderChar">
+    <w:name w:val="Header Char"/>
+    <w:basedOn w:val="DefaultParagraphFont"/>
+    <w:link w:val="Header"/>
+    <w:uiPriority w:val="99"/>
+    <w:rsid w:val="00091F25"/>
+  </w:style>
+  <w:style w:type="paragraph" w:styleId="Footer">
+    <w:name w:val="footer"/>
+    <w:basedOn w:val="Normal"/>
+    <w:link w:val="FooterChar"/>
+    <w:uiPriority w:val="99"/>
+    <w:unhideWhenUsed/>
+    <w:rsid w:val="00091F25"/>
+    <w:pPr>
+      <w:tabs>
+        <w:tab w:val="center" w:pos="4680"/>
+        <w:tab w:val="right" w:pos="9360"/>
+      </w:tabs>
+      <w:spacing w:after="0" w:line="240" w:lineRule="auto"/>
+    </w:pPr>
+  </w:style>
+  <w:style w:type="character" w:customStyle="1" w:styleId="FooterChar">
+    <w:name w:val="Footer Char"/>
+    <w:basedOn w:val="DefaultParagraphFont"/>
+    <w:link w:val="Footer"/>
+    <w:uiPriority w:val="99"/>
+    <w:rsid w:val="00091F25"/>
+  </w:style>
 </w:styles>
 </file>
 

</xml_diff>